<commit_message>
Add reports for BA meeting analysis, multi-skill lessons, and vision & scope review
- Created a report detailing the analysis from the BA/mentor meeting on 2026-10-06, outlining the roadmap and key decisions made regarding automated testing, course structure, and AI integration.
- Developed a report on the implementation of multi-skill lessons, addressing the need for a unified lesson structure that incorporates Reading, Listening, and Writing skills, while deferring Speaking for future consideration.
- Compiled a review report on the vision and scope, highlighting necessary corrections and enhancements based on mentor feedback, including the alignment of core features and the exclusion of certain functionalities.
</commit_message>
<xml_diff>
--- a/capstone-docs/rp_1_vision-scope/Report 1_Vision_Scope_IeltsPath.docx
+++ b/capstone-docs/rp_1_vision-scope/Report 1_Vision_Scope_IeltsPath.docx
@@ -76,7 +76,7 @@
           <w:u w:val="none"/>
           <w:lang w:val="en"/>
         </w:rPr>
-        <w:t>- Report 1-</w:t>
+        <w:t xml:space="preserve">(IELTSPath) - Report 1</w:t>
       </w:r>
     </w:p>
     <w:p xmlns:wp14="http://schemas.microsoft.com/office/word/2010/wordml" wp14:textId="3083FD3A">
@@ -260,7 +260,7 @@
                 <w:szCs w:val="24"/>
                 <w:u w:val="none"/>
               </w:rPr>
-              <w:t>v1.0.0</w:t>
+              <w:t xml:space="preserve">v1.1.0</w:t>
             </w:r>
           </w:p>
         </w:tc>
@@ -345,7 +345,7 @@
                 <w:szCs w:val="24"/>
                 <w:u w:val="none"/>
               </w:rPr>
-              <w:t>9/9/2026</w:t>
+              <w:t xml:space="preserve">09/09/2026</w:t>
             </w:r>
           </w:p>
         </w:tc>
@@ -430,7 +430,7 @@
                 <w:szCs w:val="24"/>
                 <w:u w:val="none"/>
               </w:rPr>
-              <w:t>[DD/MM/YYYY]</w:t>
+              <w:t xml:space="preserve">07/10/2026</w:t>
             </w:r>
           </w:p>
         </w:tc>
@@ -516,7 +516,7 @@
                 <w:u w:val="none"/>
                 <w:lang w:val="en-US"/>
               </w:rPr>
-              <w:t>PhuPD</w:t>
+              <w:t xml:space="preserve">PhuPD; [other team members]</w:t>
             </w:r>
           </w:p>
         </w:tc>
@@ -601,7 +601,7 @@
                 <w:szCs w:val="24"/>
                 <w:u w:val="none"/>
               </w:rPr>
-              <w:t>[Reviewer Name]</w:t>
+              <w:t xml:space="preserve">[Supervisor name]</w:t>
             </w:r>
           </w:p>
         </w:tc>
@@ -686,7 +686,7 @@
                 <w:szCs w:val="24"/>
                 <w:u w:val="none"/>
               </w:rPr>
-              <w:t>Draft / In Review / Approved</w:t>
+              <w:t xml:space="preserve">In Review</w:t>
             </w:r>
           </w:p>
         </w:tc>
@@ -944,7 +944,7 @@
                 <w:szCs w:val="24"/>
                 <w:u w:val="none"/>
               </w:rPr>
-              <w:t>v1.0.0</w:t>
+              <w:t xml:space="preserve">v1.0.0</w:t>
             </w:r>
           </w:p>
         </w:tc>
@@ -985,7 +985,7 @@
                 <w:szCs w:val="24"/>
                 <w:u w:val="none"/>
               </w:rPr>
-              <w:t>[DD/MM/YYYY]</w:t>
+              <w:t xml:space="preserve">09/09/2026</w:t>
             </w:r>
           </w:p>
         </w:tc>
@@ -1026,7 +1026,7 @@
                 <w:szCs w:val="24"/>
                 <w:u w:val="none"/>
               </w:rPr>
-              <w:t>Initial creation</w:t>
+              <w:t xml:space="preserve">Initial creation</w:t>
             </w:r>
           </w:p>
         </w:tc>
@@ -1067,7 +1067,176 @@
                 <w:szCs w:val="24"/>
                 <w:u w:val="none"/>
               </w:rPr>
-              <w:t>[Author]</w:t>
+              <w:t xml:space="preserve">PhuPD</w:t>
+            </w:r>
+          </w:p>
+        </w:tc>
+      </w:tr>
+      <w:tr>
+        <w:trPr>
+          <w:trHeight w:val="300"/>
+        </w:trPr>
+        <w:tc>
+          <w:tcPr>
+            <w:tcW w:w="1208" w:type="dxa"/>
+            <w:tcBorders>
+              <w:top w:val="single" w:color="AAAAAA" w:sz="6"/>
+              <w:left w:val="single" w:color="AAAAAA" w:sz="6"/>
+              <w:bottom w:val="single" w:color="AAAAAA" w:sz="6"/>
+              <w:right w:val="single" w:color="AAAAAA" w:sz="6"/>
+            </w:tcBorders>
+            <w:shd w:val="clear" w:color="auto" w:fill="FFFFFF" w:themeFill="background1"/>
+            <w:tcMar>
+              <w:top w:w="90" w:type="dxa"/>
+              <w:left w:w="140" w:type="dxa"/>
+              <w:bottom w:w="90" w:type="dxa"/>
+              <w:right w:w="140" w:type="dxa"/>
+            </w:tcMar>
+            <w:vAlign w:val="top"/>
+          </w:tcPr>
+          <w:p>
+            <w:pPr>
+              <w:bidi w:val="0"/>
+              <w:spacing w:before="0" w:beforeAutospacing="off" w:after="0" w:afterAutospacing="off"/>
+            </w:pPr>
+            <w:r>
+              <w:rPr>
+                <w:rFonts w:ascii="Arial" w:hAnsi="Arial" w:eastAsia="Arial" w:cs="Arial"/>
+                <w:b w:val="0"/>
+                <w:bCs w:val="0"/>
+                <w:i w:val="0"/>
+                <w:iCs w:val="0"/>
+                <w:strike w:val="0"/>
+                <w:dstrike w:val="0"/>
+                <w:color w:val="000000" w:themeColor="text1" w:themeTint="FF" w:themeShade="FF"/>
+                <w:sz w:val="24"/>
+                <w:szCs w:val="24"/>
+                <w:u w:val="none"/>
+              </w:rPr>
+              <w:t xml:space="preserve">v1.1.0</w:t>
+            </w:r>
+          </w:p>
+        </w:tc>
+        <w:tc>
+          <w:tcPr>
+            <w:tcW w:w="2033" w:type="dxa"/>
+            <w:tcBorders>
+              <w:top w:val="single" w:color="AAAAAA" w:sz="6"/>
+              <w:left w:val="single" w:color="AAAAAA" w:sz="6"/>
+              <w:bottom w:val="single" w:color="AAAAAA" w:sz="6"/>
+              <w:right w:val="single" w:color="AAAAAA" w:sz="6"/>
+            </w:tcBorders>
+            <w:shd w:val="clear" w:color="auto" w:fill="FFFFFF" w:themeFill="background1"/>
+            <w:tcMar>
+              <w:top w:w="90" w:type="dxa"/>
+              <w:left w:w="140" w:type="dxa"/>
+              <w:bottom w:w="90" w:type="dxa"/>
+              <w:right w:w="140" w:type="dxa"/>
+            </w:tcMar>
+            <w:vAlign w:val="top"/>
+          </w:tcPr>
+          <w:p>
+            <w:pPr>
+              <w:bidi w:val="0"/>
+              <w:spacing w:before="0" w:beforeAutospacing="off" w:after="0" w:afterAutospacing="off"/>
+            </w:pPr>
+            <w:r>
+              <w:rPr>
+                <w:rFonts w:ascii="Arial" w:hAnsi="Arial" w:eastAsia="Arial" w:cs="Arial"/>
+                <w:b w:val="0"/>
+                <w:bCs w:val="0"/>
+                <w:i w:val="0"/>
+                <w:iCs w:val="0"/>
+                <w:strike w:val="0"/>
+                <w:dstrike w:val="0"/>
+                <w:color w:val="000000" w:themeColor="text1" w:themeTint="FF" w:themeShade="FF"/>
+                <w:sz w:val="24"/>
+                <w:szCs w:val="24"/>
+                <w:u w:val="none"/>
+              </w:rPr>
+              <w:t xml:space="preserve">07/10/2026</w:t>
+            </w:r>
+          </w:p>
+        </w:tc>
+        <w:tc>
+          <w:tcPr>
+            <w:tcW w:w="4208" w:type="dxa"/>
+            <w:tcBorders>
+              <w:top w:val="single" w:color="AAAAAA" w:sz="6"/>
+              <w:left w:val="single" w:color="AAAAAA" w:sz="6"/>
+              <w:bottom w:val="single" w:color="AAAAAA" w:sz="6"/>
+              <w:right w:val="single" w:color="AAAAAA" w:sz="6"/>
+            </w:tcBorders>
+            <w:shd w:val="clear" w:color="auto" w:fill="FFFFFF" w:themeFill="background1"/>
+            <w:tcMar>
+              <w:top w:w="90" w:type="dxa"/>
+              <w:left w:w="140" w:type="dxa"/>
+              <w:bottom w:w="90" w:type="dxa"/>
+              <w:right w:w="140" w:type="dxa"/>
+            </w:tcMar>
+            <w:vAlign w:val="top"/>
+          </w:tcPr>
+          <w:p>
+            <w:pPr>
+              <w:bidi w:val="0"/>
+              <w:spacing w:before="0" w:beforeAutospacing="off" w:after="0" w:afterAutospacing="off"/>
+            </w:pPr>
+            <w:r>
+              <w:rPr>
+                <w:rFonts w:ascii="Arial" w:hAnsi="Arial" w:eastAsia="Arial" w:cs="Arial"/>
+                <w:b w:val="0"/>
+                <w:bCs w:val="0"/>
+                <w:i w:val="0"/>
+                <w:iCs w:val="0"/>
+                <w:strike w:val="0"/>
+                <w:dstrike w:val="0"/>
+                <w:color w:val="000000" w:themeColor="text1" w:themeTint="FF" w:themeShade="FF"/>
+                <w:sz w:val="24"/>
+                <w:szCs w:val="24"/>
+                <w:u w:val="none"/>
+              </w:rPr>
+              <w:t xml:space="preserve">Aligned scope with the implemented system and mentor feedback: business case for new and current learners, third existing solution, GAP IDs, updated features and exclusions</w:t>
+            </w:r>
+          </w:p>
+        </w:tc>
+        <w:tc>
+          <w:tcPr>
+            <w:tcW w:w="1613" w:type="dxa"/>
+            <w:tcBorders>
+              <w:top w:val="single" w:color="AAAAAA" w:sz="6"/>
+              <w:left w:val="single" w:color="AAAAAA" w:sz="6"/>
+              <w:bottom w:val="single" w:color="AAAAAA" w:sz="6"/>
+              <w:right w:val="single" w:color="AAAAAA" w:sz="6"/>
+            </w:tcBorders>
+            <w:shd w:val="clear" w:color="auto" w:fill="FFFFFF" w:themeFill="background1"/>
+            <w:tcMar>
+              <w:top w:w="90" w:type="dxa"/>
+              <w:left w:w="140" w:type="dxa"/>
+              <w:bottom w:w="90" w:type="dxa"/>
+              <w:right w:w="140" w:type="dxa"/>
+            </w:tcMar>
+            <w:vAlign w:val="top"/>
+          </w:tcPr>
+          <w:p>
+            <w:pPr>
+              <w:bidi w:val="0"/>
+              <w:spacing w:before="0" w:beforeAutospacing="off" w:after="0" w:afterAutospacing="off"/>
+            </w:pPr>
+            <w:r>
+              <w:rPr>
+                <w:rFonts w:ascii="Arial" w:hAnsi="Arial" w:eastAsia="Arial" w:cs="Arial"/>
+                <w:b w:val="0"/>
+                <w:bCs w:val="0"/>
+                <w:i w:val="0"/>
+                <w:iCs w:val="0"/>
+                <w:strike w:val="0"/>
+                <w:dstrike w:val="0"/>
+                <w:color w:val="000000" w:themeColor="text1" w:themeTint="FF" w:themeShade="FF"/>
+                <w:sz w:val="24"/>
+                <w:szCs w:val="24"/>
+                <w:u w:val="none"/>
+              </w:rPr>
+              <w:t xml:space="preserve">[Author]</w:t>
             </w:r>
           </w:p>
         </w:tc>
@@ -1119,7 +1288,7 @@
           <w:u w:val="none"/>
           <w:lang w:val="en-US"/>
         </w:rPr>
-        <w:t>IELTS learners need to prepare multiple skills simultaneously and maintain consistent study over a long period, often alongside their school or work schedules. For self-learners, the difficulties lie not only in finding materials or doing practice exercises, but also in identifying their weaknesses, determining which areas to focus their time on, and knowing whether practice is actually helping them improve.</w:t>
+        <w:t xml:space="preserve">IELTS Space is an IELTS training centre in Hanoi that teaches IELTS in band-based classes. The centre commissioned this project because two groups of its learners are poorly served by the classroom alone.</w:t>
       </w:r>
     </w:p>
     <w:p xmlns:wp14="http://schemas.microsoft.com/office/word/2010/wordml" wp14:textId="3C775195">
@@ -1143,7 +1312,7 @@
           <w:u w:val="none"/>
           <w:lang w:val="en-US"/>
         </w:rPr>
-        <w:t>A study at a Vietnamese university surveyed 827 students about their English learning experience, combining in-person and online learning. The results showed moderate engagement in online learning, while engagement in in-person learning was high. Interviews also identified self-management of learning, peer interaction, teaching support, and content relevance as factors influencing engagement (Tran et al., 2026). This study did not specifically examine IELTS learners or personalized learning paths, but suggests that content relevance and self-management are related to the online learning experience.</w:t>
+        <w:t xml:space="preserve">The first group is people who have not yet enrolled. Before paying for a course, they want to see how the centre teaches and whether its lessons suit their level. Today the centre can only offer them a consultation, so their choice of centre depends on what they hear rather than what they experience. The second group is current students, including those who have finished one level and are waiting about a week for the next class to start. Between lessons they practise on their own, with the materials the centre hands out or on free websites, and the centre cannot see what they practise or where they struggle. Learners also arrive at different levels: a learner placed at band 5.0 and one placed at 6.5 need different material, even if both are aiming for 7.0.</w:t>
       </w:r>
     </w:p>
     <w:p xmlns:wp14="http://schemas.microsoft.com/office/word/2010/wordml" wp14:textId="513741A3">
@@ -1167,7 +1336,7 @@
           <w:u w:val="none"/>
           <w:lang w:val="en-US"/>
         </w:rPr>
-        <w:t>Learning needs vary from person to person: initial skill level, target scores, strengths and weaknesses, and available study time are all different. Therefore, a one-size-fits-all study plan may not help each individual prioritize areas for improvement. Learners may continue practicing but still not know how to adjust their plan when results don't meet expectations.</w:t>
+        <w:t xml:space="preserve">Consider Linh, a second-year student in the centre's band 5.5 class who wants to reach 6.5. Between lessons she works through the centre's handouts and a few practice tests online, and she sees her scores, but not which reading skill keeps costing her marks or what she should study next. In the week between finishing her level and starting the next class, she barely practises. Her teacher has no record of what she did. Meanwhile her friend Nam is choosing between IELTS Space and another centre. After a consultation he still has not seen a lesson, so he decides on price.</w:t>
       </w:r>
     </w:p>
     <w:p xmlns:wp14="http://schemas.microsoft.com/office/word/2010/wordml" wp14:textId="09576261">
@@ -1191,7 +1360,31 @@
           <w:u w:val="none"/>
           <w:lang w:val="en-US"/>
         </w:rPr>
-        <w:t>Without guidance that aligns with their needs and pace, learners may struggle to maintain their studies, allocate their time inefficiently, and take longer to identify areas for improvement.</w:t>
+        <w:t xml:space="preserve">These gaps have a cost for both sides. The centre currently has no record of how its students practise between lessons, and no way to show a lesson to a visitor before they enrol. Every visitor who leaves without experiencing the teaching is a possible enrolment lost, and every student who practises without direction spends time that does not target their real weaknesses.</w:t>
+      </w:r>
+    </w:p>
+    <w:p>
+      <w:pPr>
+        <w:bidi w:val="0"/>
+        <w:spacing w:before="240" w:beforeAutospacing="off" w:after="240" w:afterAutospacing="off" w:lineRule="auto"/>
+      </w:pPr>
+      <w:r>
+        <w:rPr>
+          <w:rFonts w:ascii="Arial" w:hAnsi="Arial" w:eastAsia="Arial" w:cs="Arial"/>
+          <w:b w:val="0"/>
+          <w:bCs w:val="0"/>
+          <w:i w:val="0"/>
+          <w:iCs w:val="0"/>
+          <w:strike w:val="0"/>
+          <w:dstrike w:val="0"/>
+          <w:noProof w:val="0"/>
+          <w:color w:val="000000" w:themeColor="text1" w:themeTint="FF" w:themeShade="FF"/>
+          <w:sz w:val="24"/>
+          <w:szCs w:val="24"/>
+          <w:u w:val="none"/>
+          <w:lang w:val="en-US"/>
+        </w:rPr>
+        <w:t xml:space="preserve">The timing matters because learners already practise online. The question is whether they do it on general platforms that know nothing about their class, or on a channel run by the centre that teaches them. IELTS Space sells its programmes through its sales staff rather than online, so a new channel has to fit that existing sales process instead of adding payment and accounting work.</w:t>
       </w:r>
     </w:p>
     <w:p xmlns:wp14="http://schemas.microsoft.com/office/word/2010/wordml" wp14:textId="7F77A27D">
@@ -1250,7 +1443,7 @@
           <w:u w:val="none"/>
           <w:lang w:val="en-US"/>
         </w:rPr>
-        <w:t>2.1  [Solution Name 1]</w:t>
+        <w:t xml:space="preserve">2.1  STUDY4</w:t>
       </w:r>
     </w:p>
     <w:p xmlns:wp14="http://schemas.microsoft.com/office/word/2010/wordml" wp14:textId="2804BD11">
@@ -1258,6 +1451,24 @@
         <w:bidi w:val="0"/>
         <w:spacing w:before="2000" w:lineRule="auto"/>
       </w:pPr>
+      <w:r>
+        <w:rPr>
+          <w:rFonts w:ascii="Arial" w:hAnsi="Arial" w:eastAsia="Arial" w:cs="Arial"/>
+          <w:b w:val="0"/>
+          <w:bCs w:val="0"/>
+          <w:i w:val="0"/>
+          <w:iCs w:val="0"/>
+          <w:strike w:val="0"/>
+          <w:dstrike w:val="0"/>
+          <w:noProof w:val="0"/>
+          <w:color w:val="000000" w:themeColor="text1" w:themeTint="FF" w:themeShade="FF"/>
+          <w:sz w:val="24"/>
+          <w:szCs w:val="24"/>
+          <w:u w:val="none"/>
+          <w:lang w:val="en-US"/>
+        </w:rPr>
+        <w:t xml:space="preserve">STUDY4 is a Vietnamese online platform for IELTS practice tests and skill courses, widely used by self-learners to get familiar with the exam format.</w:t>
+      </w:r>
     </w:p>
     <w:tbl>
       <w:tblPr>
@@ -1528,7 +1739,7 @@
                 <w:szCs w:val="24"/>
                 <w:u w:val="none"/>
               </w:rPr>
-              <w:t>Vietnamese learners are preparing for the IELTS exam, ranging from those needing to build a foundation of knowledge to candidates aiming for a higher band score.</w:t>
+              <w:t xml:space="preserve">Vietnamese learners preparing for the IELTS exam, from those building a foundation to candidates aiming for a higher band score.</w:t>
             </w:r>
           </w:p>
         </w:tc>
@@ -1615,29 +1826,7 @@
                 <w:szCs w:val="24"/>
                 <w:u w:val="none"/>
               </w:rPr>
-              <w:t>STUDY4 offers online IELTS courses, divided into four skills: Listening, Speaking, Reading, and Writing.</w:t>
-            </w:r>
-          </w:p>
-          <w:p>
-            <w:pPr>
-              <w:bidi w:val="0"/>
-              <w:spacing w:before="0" w:beforeAutospacing="off" w:after="0" w:afterAutospacing="off"/>
-            </w:pPr>
-            <w:r>
-              <w:rPr>
-                <w:rFonts w:ascii="Arial" w:hAnsi="Arial" w:eastAsia="Arial" w:cs="Arial"/>
-                <w:b w:val="0"/>
-                <w:bCs w:val="0"/>
-                <w:i w:val="0"/>
-                <w:iCs w:val="0"/>
-                <w:strike w:val="0"/>
-                <w:dstrike w:val="0"/>
-                <w:color w:val="000000" w:themeColor="text1" w:themeTint="FF" w:themeShade="FF"/>
-                <w:sz w:val="24"/>
-                <w:szCs w:val="24"/>
-                <w:u w:val="none"/>
-              </w:rPr>
-              <w:t>Practice tests for IELTS skills along with accompanying study materials.</w:t>
+              <w:t xml:space="preserve">Online IELTS courses for Listening, Speaking, Reading and Writing; practice tests for each skill with study materials.</w:t>
             </w:r>
           </w:p>
         </w:tc>
@@ -1724,29 +1913,7 @@
                 <w:szCs w:val="24"/>
                 <w:u w:val="none"/>
               </w:rPr>
-              <w:t>It helps learners practice and improve their IELTS skills through practice tests.</w:t>
-            </w:r>
-          </w:p>
-          <w:p>
-            <w:pPr>
-              <w:bidi w:val="0"/>
-              <w:spacing w:before="0" w:beforeAutospacing="off" w:after="0" w:afterAutospacing="off"/>
-            </w:pPr>
-            <w:r>
-              <w:rPr>
-                <w:rFonts w:ascii="Arial" w:hAnsi="Arial" w:eastAsia="Arial" w:cs="Arial"/>
-                <w:b w:val="0"/>
-                <w:bCs w:val="0"/>
-                <w:i w:val="0"/>
-                <w:iCs w:val="0"/>
-                <w:strike w:val="0"/>
-                <w:dstrike w:val="0"/>
-                <w:color w:val="000000" w:themeColor="text1" w:themeTint="FF" w:themeShade="FF"/>
-                <w:sz w:val="24"/>
-                <w:szCs w:val="24"/>
-                <w:u w:val="none"/>
-              </w:rPr>
-              <w:t>The most useful aspect of this platform is helping learners practice, familiarize themselves with question types, and prepare for exams.</w:t>
+              <w:t xml:space="preserve">Learners can practise many tests, get familiar with each question type and prepare for the exam format.</w:t>
             </w:r>
           </w:p>
         </w:tc>
@@ -1834,53 +2001,7 @@
                 <w:u w:val="none"/>
                 <w:lang w:val="en-US"/>
               </w:rPr>
-              <w:t>The feedback after completing the test mainly shows the score and the number of correct answers. Learners are not given a detailed analysis of why they made mistakes, which areas of knowledge need improvement, and what they should do to correct them.</w:t>
-            </w:r>
-          </w:p>
-          <w:p>
-            <w:pPr>
-              <w:bidi w:val="0"/>
-              <w:spacing w:before="0" w:beforeAutospacing="off" w:after="0" w:afterAutospacing="off"/>
-            </w:pPr>
-            <w:r>
-              <w:rPr>
-                <w:rFonts w:ascii="Arial" w:hAnsi="Arial" w:eastAsia="Arial" w:cs="Arial"/>
-                <w:b w:val="0"/>
-                <w:bCs w:val="0"/>
-                <w:i w:val="0"/>
-                <w:iCs w:val="0"/>
-                <w:strike w:val="0"/>
-                <w:dstrike w:val="0"/>
-                <w:color w:val="000000" w:themeColor="text1" w:themeTint="FF" w:themeShade="FF"/>
-                <w:sz w:val="24"/>
-                <w:szCs w:val="24"/>
-                <w:u w:val="none"/>
-                <w:lang w:val="en-US"/>
-              </w:rPr>
-              <w:t>Focusing on practice tests, but neglecting to reinforce knowledge before attempting the tests.</w:t>
-            </w:r>
-          </w:p>
-          <w:p>
-            <w:pPr>
-              <w:bidi w:val="0"/>
-              <w:spacing w:before="0" w:beforeAutospacing="off" w:after="0" w:afterAutospacing="off"/>
-            </w:pPr>
-            <w:r>
-              <w:rPr>
-                <w:rFonts w:ascii="Arial" w:hAnsi="Arial" w:eastAsia="Arial" w:cs="Arial"/>
-                <w:b w:val="0"/>
-                <w:bCs w:val="0"/>
-                <w:i w:val="0"/>
-                <w:iCs w:val="0"/>
-                <w:strike w:val="0"/>
-                <w:dstrike w:val="0"/>
-                <w:color w:val="000000" w:themeColor="text1" w:themeTint="FF" w:themeShade="FF"/>
-                <w:sz w:val="24"/>
-                <w:szCs w:val="24"/>
-                <w:u w:val="none"/>
-                <w:lang w:val="en-US"/>
-              </w:rPr>
-              <w:t>The grading for Writing and Speaking is not accurate or consistent enough.</w:t>
+              <w:t xml:space="preserve">Feedback after a test mainly shows the score and the number of correct answers; it does not explain why answers were wrong, which knowledge is missing or what to study next. The platform focuses on practice tests rather than building the knowledge needed before taking them.</w:t>
             </w:r>
           </w:p>
         </w:tc>
@@ -1968,7 +2089,30 @@
                 <w:u w:val="none"/>
                 <w:lang w:val="en-US"/>
               </w:rPr>
-              <w:t>STUDY4 offers courses and practice tests for each IELTS skill, helping learners familiarize themselves with the exam format. However, as mentioned in the review above, the test results are not analyzed in enough detail to identify mistakes, knowledge gaps, and areas for further study for each individual.</w:t>
+              <w:t xml:space="preserve">GAP-01: Test results show scores but not the knowledge behind each mistake or what to study next.</w:t>
+            </w:r>
+          </w:p>
+          <w:p>
+            <w:pPr>
+              <w:bidi w:val="0"/>
+              <w:spacing w:before="0" w:beforeAutospacing="off" w:after="0" w:afterAutospacing="off"/>
+            </w:pPr>
+            <w:r>
+              <w:rPr>
+                <w:rFonts w:ascii="Arial" w:hAnsi="Arial" w:eastAsia="Arial" w:cs="Arial"/>
+                <w:b w:val="0"/>
+                <w:bCs w:val="0"/>
+                <w:i w:val="0"/>
+                <w:iCs w:val="0"/>
+                <w:strike w:val="0"/>
+                <w:dstrike w:val="0"/>
+                <w:color w:val="000000" w:themeColor="text1" w:themeTint="FF" w:themeShade="FF"/>
+                <w:sz w:val="24"/>
+                <w:szCs w:val="24"/>
+                <w:u w:val="none"/>
+                <w:lang w:val="en-US"/>
+              </w:rPr>
+              <w:t xml:space="preserve">GAP-02: Learners practise full tests without first learning the knowledge each question type requires.</w:t>
             </w:r>
           </w:p>
         </w:tc>
@@ -2005,7 +2149,7 @@
           <w:u w:val="none"/>
           <w:lang w:val="en-US"/>
         </w:rPr>
-        <w:t>2.2  [Solution Name 2]</w:t>
+        <w:t xml:space="preserve">2.2  ELSA Speak</w:t>
       </w:r>
     </w:p>
     <w:p xmlns:wp14="http://schemas.microsoft.com/office/word/2010/wordml" wp14:textId="24A29AD8">
@@ -2013,12 +2157,24 @@
         <w:bidi w:val="0"/>
         <w:spacing w:before="2000" w:lineRule="auto"/>
       </w:pPr>
-    </w:p>
-    <w:p xmlns:wp14="http://schemas.microsoft.com/office/word/2010/wordml" wp14:textId="5F75305C">
-      <w:pPr>
-        <w:bidi w:val="0"/>
-        <w:spacing w:before="2000" w:lineRule="auto"/>
-      </w:pPr>
+      <w:r>
+        <w:rPr>
+          <w:rFonts w:ascii="Arial" w:hAnsi="Arial" w:eastAsia="Arial" w:cs="Arial"/>
+          <w:b w:val="0"/>
+          <w:bCs w:val="0"/>
+          <w:i w:val="0"/>
+          <w:iCs w:val="0"/>
+          <w:strike w:val="0"/>
+          <w:dstrike w:val="0"/>
+          <w:noProof w:val="0"/>
+          <w:color w:val="000000" w:themeColor="text1" w:themeTint="FF" w:themeShade="FF"/>
+          <w:sz w:val="24"/>
+          <w:szCs w:val="24"/>
+          <w:u w:val="none"/>
+          <w:lang w:val="en-US"/>
+        </w:rPr>
+        <w:t xml:space="preserve">ELSA Speak is an AI pronunciation and speaking coach for English learners, with an IELTS Speaking course among its offerings.</w:t>
+      </w:r>
     </w:p>
     <w:tbl>
       <w:tblPr>
@@ -2466,7 +2622,7 @@
                 <w:u w:val="none"/>
                 <w:lang w:val="en-US"/>
               </w:rPr>
-              <w:t>Create numerous opportunities for active speaking practice and receive quick feedback on your speaking style. Personalized learning paths, AI-powered conversations, and interactive activities help learners practice communication according to their goals.</w:t>
+              <w:t xml:space="preserve">It gives learners many chances to speak and quick feedback on their delivery. Personalised learning paths, AI conversations and interactive activities help learners practise communication for their own goals.</w:t>
             </w:r>
           </w:p>
         </w:tc>
@@ -2553,7 +2709,7 @@
                 <w:szCs w:val="24"/>
                 <w:u w:val="none"/>
               </w:rPr>
-              <w:t>ELSA focuses primarily on English communication and speaking practice. In the publicly available content surveyed, there is no comprehensive IELTS preparation roadmap that integrates all four skills, along with corresponding practice tests.</w:t>
+              <w:t xml:space="preserve">ELSA focuses on spoken English. In the public content we reviewed, there is no IELTS preparation path that covers Reading, Listening and Writing together with matching practice tests.</w:t>
             </w:r>
           </w:p>
         </w:tc>
@@ -2640,7 +2796,7 @@
                 <w:szCs w:val="24"/>
                 <w:u w:val="none"/>
               </w:rPr>
-              <w:t>ELSA supports personalized speaking practice, while the project aims to create a broader self-study channel to supplement IELTS preparation.</w:t>
+              <w:t xml:space="preserve">GAP-03: ELSA personalises speaking practice, but no IELTS path connects practice in all four skills with feedback on written and spoken answers against the IELTS criteria.</w:t>
             </w:r>
           </w:p>
         </w:tc>
@@ -2651,6 +2807,800 @@
         <w:bidi w:val="0"/>
         <w:spacing w:before="2000" w:lineRule="auto"/>
       </w:pPr>
+    </w:p>
+    <w:p>
+      <w:pPr>
+        <w:pStyle w:val="Heading2"/>
+        <w:pBdr>
+          <w:bottom w:val="single" w:color="2E75B6" w:sz="6" w:space="4"/>
+        </w:pBdr>
+        <w:bidi w:val="0"/>
+        <w:spacing w:before="280" w:beforeAutospacing="off" w:after="100" w:afterAutospacing="off" w:lineRule="auto"/>
+      </w:pPr>
+      <w:r>
+        <w:rPr>
+          <w:rFonts w:ascii="Arial" w:hAnsi="Arial" w:eastAsia="Arial" w:cs="Arial"/>
+          <w:b w:val="1"/>
+          <w:bCs w:val="1"/>
+          <w:i w:val="0"/>
+          <w:iCs w:val="0"/>
+          <w:strike w:val="0"/>
+          <w:dstrike w:val="0"/>
+          <w:noProof w:val="0"/>
+          <w:color w:val="2E75B6"/>
+          <w:sz w:val="28"/>
+          <w:szCs w:val="28"/>
+          <w:u w:val="none"/>
+          <w:lang w:val="en-US"/>
+        </w:rPr>
+        <w:t xml:space="preserve">2.3  IELTS Space's Current Out-of-Class Practice</w:t>
+      </w:r>
+    </w:p>
+    <w:p>
+      <w:pPr>
+        <w:bidi w:val="0"/>
+        <w:spacing w:before="2000" w:lineRule="auto"/>
+      </w:pPr>
+      <w:r>
+        <w:rPr>
+          <w:rFonts w:ascii="Arial" w:hAnsi="Arial" w:eastAsia="Arial" w:cs="Arial"/>
+          <w:b w:val="0"/>
+          <w:bCs w:val="0"/>
+          <w:i w:val="0"/>
+          <w:iCs w:val="0"/>
+          <w:strike w:val="0"/>
+          <w:dstrike w:val="0"/>
+          <w:noProof w:val="0"/>
+          <w:color w:val="000000" w:themeColor="text1" w:themeTint="FF" w:themeShade="FF"/>
+          <w:sz w:val="24"/>
+          <w:szCs w:val="24"/>
+          <w:u w:val="none"/>
+          <w:lang w:val="en-US"/>
+        </w:rPr>
+        <w:t xml:space="preserve">Today IELTS Space supports learners outside class with its own practice materials. This is the manual workaround the proposed system replaces.</w:t>
+      </w:r>
+    </w:p>
+    <w:tbl>
+      <w:tblPr>
+        <w:tblStyle w:val="TableNormal"/>
+        <w:bidiVisual w:val="0"/>
+        <w:tblW w:w="0" w:type="auto"/>
+        <w:tblLook w:val="06A0" w:firstRow="1" w:lastRow="0" w:firstColumn="1" w:lastColumn="0" w:noHBand="1" w:noVBand="1"/>
+      </w:tblPr>
+      <w:tblGrid>
+        <w:gridCol w:w="2753"/>
+        <w:gridCol w:w="6293"/>
+      </w:tblGrid>
+      <w:tr>
+        <w:trPr>
+          <w:trHeight w:val="300"/>
+        </w:trPr>
+        <w:tc>
+          <w:tcPr>
+            <w:tcW w:w="2753" w:type="dxa"/>
+            <w:tcBorders>
+              <w:top w:val="single" w:color="AAAAAA" w:sz="6"/>
+              <w:left w:val="single" w:color="AAAAAA" w:sz="6"/>
+              <w:bottom w:val="single" w:color="AAAAAA" w:sz="6"/>
+              <w:right w:val="single" w:color="AAAAAA" w:sz="6"/>
+            </w:tcBorders>
+            <w:shd w:val="clear" w:color="auto" w:fill="BDD7EE"/>
+            <w:tcMar>
+              <w:top w:w="90" w:type="dxa"/>
+              <w:left w:w="140" w:type="dxa"/>
+              <w:bottom w:w="90" w:type="dxa"/>
+              <w:right w:w="140" w:type="dxa"/>
+            </w:tcMar>
+            <w:vAlign w:val="top"/>
+          </w:tcPr>
+          <w:p>
+            <w:pPr>
+              <w:bidi w:val="0"/>
+              <w:spacing w:before="0" w:beforeAutospacing="off" w:after="0" w:afterAutospacing="off"/>
+              <w:jc w:val="center"/>
+            </w:pPr>
+            <w:r>
+              <w:rPr>
+                <w:rFonts w:ascii="Arial" w:hAnsi="Arial" w:eastAsia="Arial" w:cs="Arial"/>
+                <w:b w:val="1"/>
+                <w:bCs w:val="1"/>
+                <w:i w:val="0"/>
+                <w:iCs w:val="0"/>
+                <w:strike w:val="0"/>
+                <w:dstrike w:val="0"/>
+                <w:color w:val="1F3864"/>
+                <w:sz w:val="20"/>
+                <w:szCs w:val="20"/>
+                <w:u w:val="none"/>
+              </w:rPr>
+              <w:t>Attribute</w:t>
+            </w:r>
+          </w:p>
+        </w:tc>
+        <w:tc>
+          <w:tcPr>
+            <w:tcW w:w="6293" w:type="dxa"/>
+            <w:tcBorders>
+              <w:top w:val="single" w:color="AAAAAA" w:sz="6"/>
+              <w:left w:val="single" w:color="AAAAAA" w:sz="6"/>
+              <w:bottom w:val="single" w:color="AAAAAA" w:sz="6"/>
+              <w:right w:val="single" w:color="AAAAAA" w:sz="6"/>
+            </w:tcBorders>
+            <w:shd w:val="clear" w:color="auto" w:fill="BDD7EE"/>
+            <w:tcMar>
+              <w:top w:w="90" w:type="dxa"/>
+              <w:left w:w="140" w:type="dxa"/>
+              <w:bottom w:w="90" w:type="dxa"/>
+              <w:right w:w="140" w:type="dxa"/>
+            </w:tcMar>
+            <w:vAlign w:val="top"/>
+          </w:tcPr>
+          <w:p>
+            <w:pPr>
+              <w:bidi w:val="0"/>
+              <w:spacing w:before="0" w:beforeAutospacing="off" w:after="0" w:afterAutospacing="off"/>
+              <w:jc w:val="center"/>
+            </w:pPr>
+            <w:r>
+              <w:rPr>
+                <w:rFonts w:ascii="Arial" w:hAnsi="Arial" w:eastAsia="Arial" w:cs="Arial"/>
+                <w:b w:val="1"/>
+                <w:bCs w:val="1"/>
+                <w:i w:val="0"/>
+                <w:iCs w:val="0"/>
+                <w:strike w:val="0"/>
+                <w:dstrike w:val="0"/>
+                <w:color w:val="1F3864"/>
+                <w:sz w:val="20"/>
+                <w:szCs w:val="20"/>
+                <w:u w:val="none"/>
+              </w:rPr>
+              <w:t>Description</w:t>
+            </w:r>
+          </w:p>
+        </w:tc>
+      </w:tr>
+      <w:tr>
+        <w:trPr>
+          <w:trHeight w:val="300"/>
+        </w:trPr>
+        <w:tc>
+          <w:tcPr>
+            <w:tcW w:w="2753" w:type="dxa"/>
+            <w:tcBorders>
+              <w:top w:val="single" w:color="AAAAAA" w:sz="6"/>
+              <w:left w:val="single" w:color="AAAAAA" w:sz="6"/>
+              <w:bottom w:val="single" w:color="AAAAAA" w:sz="6"/>
+              <w:right w:val="single" w:color="AAAAAA" w:sz="6"/>
+            </w:tcBorders>
+            <w:shd w:val="clear" w:color="auto" w:fill="FFFFFF" w:themeFill="background1"/>
+            <w:tcMar>
+              <w:top w:w="90" w:type="dxa"/>
+              <w:left w:w="140" w:type="dxa"/>
+              <w:bottom w:w="90" w:type="dxa"/>
+              <w:right w:w="140" w:type="dxa"/>
+            </w:tcMar>
+            <w:vAlign w:val="top"/>
+          </w:tcPr>
+          <w:p>
+            <w:pPr>
+              <w:bidi w:val="0"/>
+              <w:spacing w:before="0" w:beforeAutospacing="off" w:after="0" w:afterAutospacing="off"/>
+            </w:pPr>
+            <w:r>
+              <w:rPr>
+                <w:rFonts w:ascii="Arial" w:hAnsi="Arial" w:eastAsia="Arial" w:cs="Arial"/>
+                <w:b w:val="0"/>
+                <w:bCs w:val="0"/>
+                <w:i w:val="0"/>
+                <w:iCs w:val="0"/>
+                <w:strike w:val="0"/>
+                <w:dstrike w:val="0"/>
+                <w:color w:val="000000" w:themeColor="text1" w:themeTint="FF" w:themeShade="FF"/>
+                <w:sz w:val="24"/>
+                <w:szCs w:val="24"/>
+                <w:u w:val="none"/>
+              </w:rPr>
+              <w:t>Website / Link</w:t>
+            </w:r>
+          </w:p>
+        </w:tc>
+        <w:tc>
+          <w:tcPr>
+            <w:tcW w:w="6293" w:type="dxa"/>
+            <w:tcBorders>
+              <w:top w:val="single" w:color="AAAAAA" w:sz="6"/>
+              <w:left w:val="single" w:color="AAAAAA" w:sz="6"/>
+              <w:bottom w:val="single" w:color="AAAAAA" w:sz="6"/>
+              <w:right w:val="single" w:color="AAAAAA" w:sz="6"/>
+            </w:tcBorders>
+            <w:shd w:val="clear" w:color="auto" w:fill="FFFFFF" w:themeFill="background1"/>
+            <w:tcMar>
+              <w:top w:w="90" w:type="dxa"/>
+              <w:left w:w="140" w:type="dxa"/>
+              <w:bottom w:w="90" w:type="dxa"/>
+              <w:right w:w="140" w:type="dxa"/>
+            </w:tcMar>
+            <w:vAlign w:val="top"/>
+          </w:tcPr>
+          <w:p>
+            <w:pPr>
+              <w:bidi w:val="0"/>
+              <w:spacing w:before="0" w:beforeAutospacing="off" w:after="0" w:afterAutospacing="off"/>
+            </w:pPr>
+            <w:r>
+              <w:rPr>
+                <w:rFonts w:ascii="Arial" w:hAnsi="Arial" w:eastAsia="Arial" w:cs="Arial"/>
+                <w:b w:val="0"/>
+                <w:bCs w:val="0"/>
+                <w:i w:val="0"/>
+                <w:iCs w:val="0"/>
+                <w:strike w:val="0"/>
+                <w:dstrike w:val="0"/>
+                <w:noProof w:val="0"/>
+                <w:color w:val="000000" w:themeColor="text1" w:themeTint="FF" w:themeShade="FF"/>
+                <w:sz w:val="24"/>
+                <w:szCs w:val="24"/>
+                <w:u w:val="none"/>
+                <w:lang w:val="en-US"/>
+              </w:rPr>
+              <w:t xml:space="preserve">N/A (internal practice at IELTS Space)</w:t>
+            </w:r>
+          </w:p>
+        </w:tc>
+      </w:tr>
+      <w:tr>
+        <w:trPr>
+          <w:trHeight w:val="300"/>
+        </w:trPr>
+        <w:tc>
+          <w:tcPr>
+            <w:tcW w:w="2753" w:type="dxa"/>
+            <w:tcBorders>
+              <w:top w:val="single" w:color="AAAAAA" w:sz="6"/>
+              <w:left w:val="single" w:color="AAAAAA" w:sz="6"/>
+              <w:bottom w:val="single" w:color="AAAAAA" w:sz="6"/>
+              <w:right w:val="single" w:color="AAAAAA" w:sz="6"/>
+            </w:tcBorders>
+            <w:shd w:val="clear" w:color="auto" w:fill="DEEAF1"/>
+            <w:tcMar>
+              <w:top w:w="90" w:type="dxa"/>
+              <w:left w:w="140" w:type="dxa"/>
+              <w:bottom w:w="90" w:type="dxa"/>
+              <w:right w:w="140" w:type="dxa"/>
+            </w:tcMar>
+            <w:vAlign w:val="top"/>
+          </w:tcPr>
+          <w:p>
+            <w:pPr>
+              <w:bidi w:val="0"/>
+              <w:spacing w:before="0" w:beforeAutospacing="off" w:after="0" w:afterAutospacing="off"/>
+            </w:pPr>
+            <w:r>
+              <w:rPr>
+                <w:rFonts w:ascii="Arial" w:hAnsi="Arial" w:eastAsia="Arial" w:cs="Arial"/>
+                <w:b w:val="0"/>
+                <w:bCs w:val="0"/>
+                <w:i w:val="0"/>
+                <w:iCs w:val="0"/>
+                <w:strike w:val="0"/>
+                <w:dstrike w:val="0"/>
+                <w:color w:val="000000" w:themeColor="text1" w:themeTint="FF" w:themeShade="FF"/>
+                <w:sz w:val="24"/>
+                <w:szCs w:val="24"/>
+                <w:u w:val="none"/>
+              </w:rPr>
+              <w:t>Target Users</w:t>
+            </w:r>
+          </w:p>
+        </w:tc>
+        <w:tc>
+          <w:tcPr>
+            <w:tcW w:w="6293" w:type="dxa"/>
+            <w:tcBorders>
+              <w:top w:val="single" w:color="AAAAAA" w:sz="6"/>
+              <w:left w:val="single" w:color="AAAAAA" w:sz="6"/>
+              <w:bottom w:val="single" w:color="AAAAAA" w:sz="6"/>
+              <w:right w:val="single" w:color="AAAAAA" w:sz="6"/>
+            </w:tcBorders>
+            <w:shd w:val="clear" w:color="auto" w:fill="DEEAF1"/>
+            <w:tcMar>
+              <w:top w:w="90" w:type="dxa"/>
+              <w:left w:w="140" w:type="dxa"/>
+              <w:bottom w:w="90" w:type="dxa"/>
+              <w:right w:w="140" w:type="dxa"/>
+            </w:tcMar>
+            <w:vAlign w:val="top"/>
+          </w:tcPr>
+          <w:p>
+            <w:pPr>
+              <w:bidi w:val="0"/>
+              <w:spacing w:before="0" w:beforeAutospacing="off" w:after="0" w:afterAutospacing="off"/>
+            </w:pPr>
+            <w:r>
+              <w:rPr>
+                <w:rFonts w:ascii="Arial" w:hAnsi="Arial" w:eastAsia="Arial" w:cs="Arial"/>
+                <w:b w:val="0"/>
+                <w:bCs w:val="0"/>
+                <w:i w:val="0"/>
+                <w:iCs w:val="0"/>
+                <w:strike w:val="0"/>
+                <w:dstrike w:val="0"/>
+                <w:color w:val="000000" w:themeColor="text1" w:themeTint="FF" w:themeShade="FF"/>
+                <w:sz w:val="24"/>
+                <w:szCs w:val="24"/>
+                <w:u w:val="none"/>
+                <w:lang w:val="en-US"/>
+              </w:rPr>
+              <w:t xml:space="preserve">Current students between classes, students waiting for their next class, and new visitors considering the centre.</w:t>
+            </w:r>
+          </w:p>
+        </w:tc>
+      </w:tr>
+      <w:tr>
+        <w:trPr>
+          <w:trHeight w:val="300"/>
+        </w:trPr>
+        <w:tc>
+          <w:tcPr>
+            <w:tcW w:w="2753" w:type="dxa"/>
+            <w:tcBorders>
+              <w:top w:val="single" w:color="AAAAAA" w:sz="6"/>
+              <w:left w:val="single" w:color="AAAAAA" w:sz="6"/>
+              <w:bottom w:val="single" w:color="AAAAAA" w:sz="6"/>
+              <w:right w:val="single" w:color="AAAAAA" w:sz="6"/>
+            </w:tcBorders>
+            <w:shd w:val="clear" w:color="auto" w:fill="FFFFFF" w:themeFill="background1"/>
+            <w:tcMar>
+              <w:top w:w="90" w:type="dxa"/>
+              <w:left w:w="140" w:type="dxa"/>
+              <w:bottom w:w="90" w:type="dxa"/>
+              <w:right w:w="140" w:type="dxa"/>
+            </w:tcMar>
+            <w:vAlign w:val="top"/>
+          </w:tcPr>
+          <w:p>
+            <w:pPr>
+              <w:bidi w:val="0"/>
+              <w:spacing w:before="0" w:beforeAutospacing="off" w:after="0" w:afterAutospacing="off"/>
+            </w:pPr>
+            <w:r>
+              <w:rPr>
+                <w:rFonts w:ascii="Arial" w:hAnsi="Arial" w:eastAsia="Arial" w:cs="Arial"/>
+                <w:b w:val="0"/>
+                <w:bCs w:val="0"/>
+                <w:i w:val="0"/>
+                <w:iCs w:val="0"/>
+                <w:strike w:val="0"/>
+                <w:dstrike w:val="0"/>
+                <w:color w:val="000000" w:themeColor="text1" w:themeTint="FF" w:themeShade="FF"/>
+                <w:sz w:val="24"/>
+                <w:szCs w:val="24"/>
+                <w:u w:val="none"/>
+              </w:rPr>
+              <w:t>Core Features</w:t>
+            </w:r>
+          </w:p>
+        </w:tc>
+        <w:tc>
+          <w:tcPr>
+            <w:tcW w:w="6293" w:type="dxa"/>
+            <w:tcBorders>
+              <w:top w:val="single" w:color="AAAAAA" w:sz="6"/>
+              <w:left w:val="single" w:color="AAAAAA" w:sz="6"/>
+              <w:bottom w:val="single" w:color="AAAAAA" w:sz="6"/>
+              <w:right w:val="single" w:color="AAAAAA" w:sz="6"/>
+            </w:tcBorders>
+            <w:shd w:val="clear" w:color="auto" w:fill="FFFFFF" w:themeFill="background1"/>
+            <w:tcMar>
+              <w:top w:w="90" w:type="dxa"/>
+              <w:left w:w="140" w:type="dxa"/>
+              <w:bottom w:w="90" w:type="dxa"/>
+              <w:right w:w="140" w:type="dxa"/>
+            </w:tcMar>
+            <w:vAlign w:val="top"/>
+          </w:tcPr>
+          <w:p>
+            <w:pPr>
+              <w:bidi w:val="0"/>
+              <w:spacing w:before="0" w:beforeAutospacing="off" w:after="0" w:afterAutospacing="off"/>
+            </w:pPr>
+            <w:r>
+              <w:rPr>
+                <w:rFonts w:ascii="Arial" w:hAnsi="Arial" w:eastAsia="Arial" w:cs="Arial"/>
+                <w:b w:val="0"/>
+                <w:bCs w:val="0"/>
+                <w:i w:val="0"/>
+                <w:iCs w:val="0"/>
+                <w:strike w:val="0"/>
+                <w:dstrike w:val="0"/>
+                <w:color w:val="000000" w:themeColor="text1" w:themeTint="FF" w:themeShade="FF"/>
+                <w:sz w:val="24"/>
+                <w:szCs w:val="24"/>
+                <w:u w:val="none"/>
+                <w:lang w:val="en-US"/>
+              </w:rPr>
+              <w:t xml:space="preserve">Teachers hand out practice materials for students to work on between lessons; new visitors can book a consultation with the centre.</w:t>
+            </w:r>
+          </w:p>
+        </w:tc>
+      </w:tr>
+      <w:tr>
+        <w:trPr>
+          <w:trHeight w:val="300"/>
+        </w:trPr>
+        <w:tc>
+          <w:tcPr>
+            <w:tcW w:w="2753" w:type="dxa"/>
+            <w:tcBorders>
+              <w:top w:val="single" w:color="AAAAAA" w:sz="6"/>
+              <w:left w:val="single" w:color="AAAAAA" w:sz="6"/>
+              <w:bottom w:val="single" w:color="AAAAAA" w:sz="6"/>
+              <w:right w:val="single" w:color="AAAAAA" w:sz="6"/>
+            </w:tcBorders>
+            <w:shd w:val="clear" w:color="auto" w:fill="DEEAF1"/>
+            <w:tcMar>
+              <w:top w:w="90" w:type="dxa"/>
+              <w:left w:w="140" w:type="dxa"/>
+              <w:bottom w:w="90" w:type="dxa"/>
+              <w:right w:w="140" w:type="dxa"/>
+            </w:tcMar>
+            <w:vAlign w:val="top"/>
+          </w:tcPr>
+          <w:p>
+            <w:pPr>
+              <w:bidi w:val="0"/>
+              <w:spacing w:before="0" w:beforeAutospacing="off" w:after="0" w:afterAutospacing="off"/>
+            </w:pPr>
+            <w:r>
+              <w:rPr>
+                <w:rFonts w:ascii="Arial" w:hAnsi="Arial" w:eastAsia="Arial" w:cs="Arial"/>
+                <w:b w:val="0"/>
+                <w:bCs w:val="0"/>
+                <w:i w:val="0"/>
+                <w:iCs w:val="0"/>
+                <w:strike w:val="0"/>
+                <w:dstrike w:val="0"/>
+                <w:color w:val="000000" w:themeColor="text1" w:themeTint="FF" w:themeShade="FF"/>
+                <w:sz w:val="24"/>
+                <w:szCs w:val="24"/>
+                <w:u w:val="none"/>
+              </w:rPr>
+              <w:t>Strengths</w:t>
+            </w:r>
+          </w:p>
+        </w:tc>
+        <w:tc>
+          <w:tcPr>
+            <w:tcW w:w="6293" w:type="dxa"/>
+            <w:tcBorders>
+              <w:top w:val="single" w:color="AAAAAA" w:sz="6"/>
+              <w:left w:val="single" w:color="AAAAAA" w:sz="6"/>
+              <w:bottom w:val="single" w:color="AAAAAA" w:sz="6"/>
+              <w:right w:val="single" w:color="AAAAAA" w:sz="6"/>
+            </w:tcBorders>
+            <w:shd w:val="clear" w:color="auto" w:fill="DEEAF1"/>
+            <w:tcMar>
+              <w:top w:w="90" w:type="dxa"/>
+              <w:left w:w="140" w:type="dxa"/>
+              <w:bottom w:w="90" w:type="dxa"/>
+              <w:right w:w="140" w:type="dxa"/>
+            </w:tcMar>
+            <w:vAlign w:val="top"/>
+          </w:tcPr>
+          <w:p>
+            <w:pPr>
+              <w:bidi w:val="0"/>
+              <w:spacing w:before="0" w:beforeAutospacing="off" w:after="0" w:afterAutospacing="off"/>
+            </w:pPr>
+            <w:r>
+              <w:rPr>
+                <w:rFonts w:ascii="Arial" w:hAnsi="Arial" w:eastAsia="Arial" w:cs="Arial"/>
+                <w:b w:val="0"/>
+                <w:bCs w:val="0"/>
+                <w:i w:val="0"/>
+                <w:iCs w:val="0"/>
+                <w:strike w:val="0"/>
+                <w:dstrike w:val="0"/>
+                <w:color w:val="000000" w:themeColor="text1" w:themeTint="FF" w:themeShade="FF"/>
+                <w:sz w:val="24"/>
+                <w:szCs w:val="24"/>
+                <w:u w:val="none"/>
+                <w:lang w:val="en-US"/>
+              </w:rPr>
+              <w:t xml:space="preserve">Practice material comes from the centre's own teachers and matches what is taught in class.</w:t>
+            </w:r>
+          </w:p>
+        </w:tc>
+      </w:tr>
+      <w:tr>
+        <w:trPr>
+          <w:trHeight w:val="300"/>
+        </w:trPr>
+        <w:tc>
+          <w:tcPr>
+            <w:tcW w:w="2753" w:type="dxa"/>
+            <w:tcBorders>
+              <w:top w:val="single" w:color="AAAAAA" w:sz="6"/>
+              <w:left w:val="single" w:color="AAAAAA" w:sz="6"/>
+              <w:bottom w:val="single" w:color="AAAAAA" w:sz="6"/>
+              <w:right w:val="single" w:color="AAAAAA" w:sz="6"/>
+            </w:tcBorders>
+            <w:shd w:val="clear" w:color="auto" w:fill="FFFFFF" w:themeFill="background1"/>
+            <w:tcMar>
+              <w:top w:w="90" w:type="dxa"/>
+              <w:left w:w="140" w:type="dxa"/>
+              <w:bottom w:w="90" w:type="dxa"/>
+              <w:right w:w="140" w:type="dxa"/>
+            </w:tcMar>
+            <w:vAlign w:val="top"/>
+          </w:tcPr>
+          <w:p>
+            <w:pPr>
+              <w:bidi w:val="0"/>
+              <w:spacing w:before="0" w:beforeAutospacing="off" w:after="0" w:afterAutospacing="off"/>
+            </w:pPr>
+            <w:r>
+              <w:rPr>
+                <w:rFonts w:ascii="Arial" w:hAnsi="Arial" w:eastAsia="Arial" w:cs="Arial"/>
+                <w:b w:val="0"/>
+                <w:bCs w:val="0"/>
+                <w:i w:val="0"/>
+                <w:iCs w:val="0"/>
+                <w:strike w:val="0"/>
+                <w:dstrike w:val="0"/>
+                <w:color w:val="000000" w:themeColor="text1" w:themeTint="FF" w:themeShade="FF"/>
+                <w:sz w:val="24"/>
+                <w:szCs w:val="24"/>
+                <w:u w:val="none"/>
+              </w:rPr>
+              <w:t>Weaknesses</w:t>
+            </w:r>
+          </w:p>
+        </w:tc>
+        <w:tc>
+          <w:tcPr>
+            <w:tcW w:w="6293" w:type="dxa"/>
+            <w:tcBorders>
+              <w:top w:val="single" w:color="AAAAAA" w:sz="6"/>
+              <w:left w:val="single" w:color="AAAAAA" w:sz="6"/>
+              <w:bottom w:val="single" w:color="AAAAAA" w:sz="6"/>
+              <w:right w:val="single" w:color="AAAAAA" w:sz="6"/>
+            </w:tcBorders>
+            <w:shd w:val="clear" w:color="auto" w:fill="FFFFFF" w:themeFill="background1"/>
+            <w:tcMar>
+              <w:top w:w="90" w:type="dxa"/>
+              <w:left w:w="140" w:type="dxa"/>
+              <w:bottom w:w="90" w:type="dxa"/>
+              <w:right w:w="140" w:type="dxa"/>
+            </w:tcMar>
+            <w:vAlign w:val="top"/>
+          </w:tcPr>
+          <w:p>
+            <w:pPr>
+              <w:bidi w:val="0"/>
+              <w:spacing w:before="0" w:beforeAutospacing="off" w:after="0" w:afterAutospacing="off"/>
+            </w:pPr>
+            <w:r>
+              <w:rPr>
+                <w:rFonts w:ascii="Arial" w:hAnsi="Arial" w:eastAsia="Arial" w:cs="Arial"/>
+                <w:b w:val="0"/>
+                <w:bCs w:val="0"/>
+                <w:i w:val="0"/>
+                <w:iCs w:val="0"/>
+                <w:strike w:val="0"/>
+                <w:dstrike w:val="0"/>
+                <w:color w:val="000000" w:themeColor="text1" w:themeTint="FF" w:themeShade="FF"/>
+                <w:sz w:val="24"/>
+                <w:szCs w:val="24"/>
+                <w:u w:val="none"/>
+              </w:rPr>
+              <w:t xml:space="preserve">Practice outside class leaves no record of progress and gives no immediate feedback; there is little to keep learners practising between classes; new visitors cannot try a lesson before enrolling, only a consultation.</w:t>
+            </w:r>
+          </w:p>
+        </w:tc>
+      </w:tr>
+      <w:tr>
+        <w:trPr>
+          <w:trHeight w:val="300"/>
+        </w:trPr>
+        <w:tc>
+          <w:tcPr>
+            <w:tcW w:w="2753" w:type="dxa"/>
+            <w:tcBorders>
+              <w:top w:val="single" w:color="AAAAAA" w:sz="6"/>
+              <w:left w:val="single" w:color="AAAAAA" w:sz="6"/>
+              <w:bottom w:val="single" w:color="AAAAAA" w:sz="6"/>
+              <w:right w:val="single" w:color="AAAAAA" w:sz="6"/>
+            </w:tcBorders>
+            <w:shd w:val="clear" w:color="auto" w:fill="DEEAF1"/>
+            <w:tcMar>
+              <w:top w:w="90" w:type="dxa"/>
+              <w:left w:w="140" w:type="dxa"/>
+              <w:bottom w:w="90" w:type="dxa"/>
+              <w:right w:w="140" w:type="dxa"/>
+            </w:tcMar>
+            <w:vAlign w:val="top"/>
+          </w:tcPr>
+          <w:p>
+            <w:pPr>
+              <w:bidi w:val="0"/>
+              <w:spacing w:before="0" w:beforeAutospacing="off" w:after="0" w:afterAutospacing="off"/>
+            </w:pPr>
+            <w:r>
+              <w:rPr>
+                <w:rFonts w:ascii="Arial" w:hAnsi="Arial" w:eastAsia="Arial" w:cs="Arial"/>
+                <w:b w:val="0"/>
+                <w:bCs w:val="0"/>
+                <w:i w:val="0"/>
+                <w:iCs w:val="0"/>
+                <w:strike w:val="0"/>
+                <w:dstrike w:val="0"/>
+                <w:color w:val="000000" w:themeColor="text1" w:themeTint="FF" w:themeShade="FF"/>
+                <w:sz w:val="24"/>
+                <w:szCs w:val="24"/>
+                <w:u w:val="none"/>
+              </w:rPr>
+              <w:t>GAP for this project</w:t>
+            </w:r>
+          </w:p>
+        </w:tc>
+        <w:tc>
+          <w:tcPr>
+            <w:tcW w:w="6293" w:type="dxa"/>
+            <w:tcBorders>
+              <w:top w:val="single" w:color="AAAAAA" w:sz="6"/>
+              <w:left w:val="single" w:color="AAAAAA" w:sz="6"/>
+              <w:bottom w:val="single" w:color="AAAAAA" w:sz="6"/>
+              <w:right w:val="single" w:color="AAAAAA" w:sz="6"/>
+            </w:tcBorders>
+            <w:shd w:val="clear" w:color="auto" w:fill="DEEAF1"/>
+            <w:tcMar>
+              <w:top w:w="90" w:type="dxa"/>
+              <w:left w:w="140" w:type="dxa"/>
+              <w:bottom w:w="90" w:type="dxa"/>
+              <w:right w:w="140" w:type="dxa"/>
+            </w:tcMar>
+            <w:vAlign w:val="top"/>
+          </w:tcPr>
+          <w:p>
+            <w:pPr>
+              <w:bidi w:val="0"/>
+              <w:spacing w:before="0" w:beforeAutospacing="off" w:after="0" w:afterAutospacing="off"/>
+            </w:pPr>
+            <w:r>
+              <w:rPr>
+                <w:rFonts w:ascii="Arial" w:hAnsi="Arial" w:eastAsia="Arial" w:cs="Arial"/>
+                <w:b w:val="0"/>
+                <w:bCs w:val="0"/>
+                <w:i w:val="0"/>
+                <w:iCs w:val="0"/>
+                <w:strike w:val="0"/>
+                <w:dstrike w:val="0"/>
+                <w:color w:val="000000" w:themeColor="text1" w:themeTint="FF" w:themeShade="FF"/>
+                <w:sz w:val="24"/>
+                <w:szCs w:val="24"/>
+                <w:u w:val="none"/>
+              </w:rPr>
+              <w:t xml:space="preserve">GAP-04: Practice between classes leaves no record, so learners cannot see their progress across topics and courses or which knowledge points are still weak.</w:t>
+            </w:r>
+          </w:p>
+          <w:p>
+            <w:pPr>
+              <w:bidi w:val="0"/>
+              <w:spacing w:before="0" w:beforeAutospacing="off" w:after="0" w:afterAutospacing="off"/>
+            </w:pPr>
+            <w:r>
+              <w:rPr>
+                <w:rFonts w:ascii="Arial" w:hAnsi="Arial" w:eastAsia="Arial" w:cs="Arial"/>
+                <w:b w:val="0"/>
+                <w:bCs w:val="0"/>
+                <w:i w:val="0"/>
+                <w:iCs w:val="0"/>
+                <w:strike w:val="0"/>
+                <w:dstrike w:val="0"/>
+                <w:color w:val="000000" w:themeColor="text1" w:themeTint="FF" w:themeShade="FF"/>
+                <w:sz w:val="24"/>
+                <w:szCs w:val="24"/>
+                <w:u w:val="none"/>
+              </w:rPr>
+              <w:t xml:space="preserve">GAP-05: New visitors cannot try the centre's teaching before enrolling, and enrolled students have no extra online content.</w:t>
+            </w:r>
+          </w:p>
+          <w:p>
+            <w:pPr>
+              <w:bidi w:val="0"/>
+              <w:spacing w:before="0" w:beforeAutospacing="off" w:after="0" w:afterAutospacing="off"/>
+            </w:pPr>
+            <w:r>
+              <w:rPr>
+                <w:rFonts w:ascii="Arial" w:hAnsi="Arial" w:eastAsia="Arial" w:cs="Arial"/>
+                <w:b w:val="0"/>
+                <w:bCs w:val="0"/>
+                <w:i w:val="0"/>
+                <w:iCs w:val="0"/>
+                <w:strike w:val="0"/>
+                <w:dstrike w:val="0"/>
+                <w:color w:val="000000" w:themeColor="text1" w:themeTint="FF" w:themeShade="FF"/>
+                <w:sz w:val="24"/>
+                <w:szCs w:val="24"/>
+                <w:u w:val="none"/>
+              </w:rPr>
+              <w:t xml:space="preserve">GAP-06: Learners practising alone lose motivation and have no community or activity that brings them back.</w:t>
+            </w:r>
+          </w:p>
+          <w:p>
+            <w:pPr>
+              <w:bidi w:val="0"/>
+              <w:spacing w:before="0" w:beforeAutospacing="off" w:after="0" w:afterAutospacing="off"/>
+            </w:pPr>
+            <w:r>
+              <w:rPr>
+                <w:rFonts w:ascii="Arial" w:hAnsi="Arial" w:eastAsia="Arial" w:cs="Arial"/>
+                <w:b w:val="0"/>
+                <w:bCs w:val="0"/>
+                <w:i w:val="0"/>
+                <w:iCs w:val="0"/>
+                <w:strike w:val="0"/>
+                <w:dstrike w:val="0"/>
+                <w:color w:val="000000" w:themeColor="text1" w:themeTint="FF" w:themeShade="FF"/>
+                <w:sz w:val="24"/>
+                <w:szCs w:val="24"/>
+                <w:u w:val="none"/>
+              </w:rPr>
+              <w:t xml:space="preserve">GAP-07: Vocabulary is learned from word lists without usage context or regular review.</w:t>
+            </w:r>
+          </w:p>
+        </w:tc>
+      </w:tr>
+    </w:tbl>
+    <w:p>
+      <w:pPr>
+        <w:bidi w:val="0"/>
+        <w:spacing w:before="2000" w:lineRule="auto"/>
+      </w:pPr>
+    </w:p>
+    <w:p>
+      <w:pPr>
+        <w:bidi w:val="0"/>
+        <w:spacing w:before="240" w:beforeAutospacing="off" w:after="240" w:afterAutospacing="off" w:lineRule="auto"/>
+      </w:pPr>
+      <w:r>
+        <w:rPr>
+          <w:rFonts w:ascii="Arial" w:hAnsi="Arial" w:eastAsia="Arial" w:cs="Arial"/>
+          <w:b w:val="0"/>
+          <w:bCs w:val="0"/>
+          <w:i w:val="0"/>
+          <w:iCs w:val="0"/>
+          <w:strike w:val="0"/>
+          <w:dstrike w:val="0"/>
+          <w:noProof w:val="0"/>
+          <w:color w:val="000000" w:themeColor="text1" w:themeTint="FF" w:themeShade="FF"/>
+          <w:sz w:val="24"/>
+          <w:szCs w:val="24"/>
+          <w:u w:val="none"/>
+          <w:lang w:val="en-US"/>
+        </w:rPr>
+        <w:t xml:space="preserve">Section summary: unmet need. </w:t>
+      </w:r>
+      <w:r>
+        <w:rPr>
+          <w:rFonts w:ascii="Arial" w:hAnsi="Arial" w:eastAsia="Arial" w:cs="Arial"/>
+          <w:b w:val="0"/>
+          <w:bCs w:val="0"/>
+          <w:i w:val="0"/>
+          <w:iCs w:val="0"/>
+          <w:strike w:val="0"/>
+          <w:dstrike w:val="0"/>
+          <w:noProof w:val="0"/>
+          <w:color w:val="000000" w:themeColor="text1" w:themeTint="FF" w:themeShade="FF"/>
+          <w:sz w:val="24"/>
+          <w:szCs w:val="24"/>
+          <w:u w:val="none"/>
+          <w:lang w:val="en-US"/>
+        </w:rPr>
+        <w:t xml:space="preserve">Test-practice platforms give scores without a learning path, speaking apps cover one skill, and the centre's own materials leave no record of progress. None of them offers learners a band-based path that teaches the knowledge first and then adapts practice to each learner's mistakes, while giving IELTS Space a channel to reach new learners and keep current students practising between classes.</w:t>
+      </w:r>
     </w:p>
     <w:p xmlns:wp14="http://schemas.microsoft.com/office/word/2010/wordml" wp14:textId="1AFAAD29">
       <w:pPr>
@@ -2698,7 +3648,7 @@
           <w:u w:val="none"/>
           <w:lang w:val="en-US"/>
         </w:rPr>
-        <w:t>The project proposes an IELTS learning platform that helps students identify their current level, target score, and areas for improvement. Based on their learning outcomes, the platform provides a personalized learning path: what knowledge to study, what question types to practice, and what content to review. This approach addresses the gap mentioned in section 2: students have access to many courses and practice tests, but still struggle to identify their weaknesses and determine what to study next.</w:t>
+        <w:t xml:space="preserve">IELTSPath is IELTS Space's online learning channel on the web and on mobile. A short placement test estimates the learner's band and recommends a course; learners may still open any course. Each course belongs to one band level and is made of topics and lessons that teach the knowledge behind each question type before practice (GAP-02). When a learner answers wrongly, the system records which knowledge point failed and assigns targeted review, so the next step is always specific (GAP-01). Written and spoken answers receive band-level feedback against the IELTS Writing and Speaking criteria, and a full four-skill mock test shows how ready the learner is for the real exam (GAP-03).</w:t>
       </w:r>
     </w:p>
     <w:p xmlns:wp14="http://schemas.microsoft.com/office/word/2010/wordml" wp14:textId="3EBE7B15">
@@ -2722,7 +3672,7 @@
           <w:u w:val="none"/>
           <w:lang w:val="en-US"/>
         </w:rPr>
-        <w:t>Learners benefit from having a clear learning direction instead of haphazardly choosing practice exercises. After each practice session, they can receive feedback on mistakes and track their progress to adjust their learning. This solution is particularly suitable for self-learners of IELTS, as each student's needs and weaknesses are different, so a fixed order of lessons is unlikely to work well for everyone.</w:t>
+        <w:t xml:space="preserve">New visitors can study free topics and experience the centre's method before enrolling (GAP-05). Current students and students on the waiting list keep a practice routine and see their own progress and weak knowledge points across topics and courses (GAP-04). Learners come back through games, competitions and a learner community (GAP-06). Vocabulary is learned in video context and reviewed with flashcards (GAP-07). Premium content is unlocked with activation cards sold by the centre's sales staff, so the centre needs no online payment process.</w:t>
       </w:r>
     </w:p>
     <w:p xmlns:wp14="http://schemas.microsoft.com/office/word/2010/wordml" wp14:textId="4B005EF0">
@@ -3017,7 +3967,7 @@
                 <w:szCs w:val="24"/>
                 <w:u w:val="none"/>
               </w:rPr>
-              <w:t>FE-01</w:t>
+              <w:t xml:space="preserve">FE-01</w:t>
             </w:r>
           </w:p>
         </w:tc>
@@ -3058,7 +4008,7 @@
                 <w:szCs w:val="24"/>
                 <w:u w:val="none"/>
               </w:rPr>
-              <w:t xml:space="preserve">Personalize the Study Plan </w:t>
+              <w:t xml:space="preserve">Placement &amp; Course Recommendation</w:t>
             </w:r>
           </w:p>
         </w:tc>
@@ -3099,7 +4049,7 @@
                 <w:szCs w:val="24"/>
                 <w:u w:val="none"/>
               </w:rPr>
-              <w:t>The suggested content and order of practice are based on each learner's level, IELTS goals, and progress.</w:t>
+              <w:t xml:space="preserve">A placement test estimates the learner's band and recommends a band-level course; learners can open any course.</w:t>
             </w:r>
           </w:p>
         </w:tc>
@@ -3140,7 +4090,7 @@
                 <w:szCs w:val="24"/>
                 <w:u w:val="none"/>
               </w:rPr>
-              <w:t xml:space="preserve">GAP-01 </w:t>
+              <w:t xml:space="preserve">GAP-01</w:t>
             </w:r>
           </w:p>
         </w:tc>
@@ -3158,35 +4108,35 @@
               <w:bottom w:val="single" w:color="AAAAAA" w:sz="6"/>
               <w:right w:val="single" w:color="AAAAAA" w:sz="6"/>
             </w:tcBorders>
-            <w:shd w:val="clear" w:color="auto" w:fill="DEEAF1"/>
-            <w:tcMar>
-              <w:top w:w="90" w:type="dxa"/>
-              <w:left w:w="140" w:type="dxa"/>
-              <w:bottom w:w="90" w:type="dxa"/>
-              <w:right w:w="140" w:type="dxa"/>
-            </w:tcMar>
-            <w:vAlign w:val="top"/>
-          </w:tcPr>
-          <w:p>
-            <w:pPr>
-              <w:bidi w:val="0"/>
-              <w:spacing w:before="0" w:beforeAutospacing="off" w:after="0" w:afterAutospacing="off"/>
-            </w:pPr>
-            <w:r>
-              <w:rPr>
-                <w:rFonts w:ascii="Arial" w:hAnsi="Arial" w:eastAsia="Arial" w:cs="Arial"/>
-                <w:b w:val="0"/>
-                <w:bCs w:val="0"/>
-                <w:i w:val="0"/>
-                <w:iCs w:val="0"/>
-                <w:strike w:val="0"/>
-                <w:dstrike w:val="0"/>
-                <w:color w:val="000000" w:themeColor="text1" w:themeTint="FF" w:themeShade="FF"/>
-                <w:sz w:val="24"/>
-                <w:szCs w:val="24"/>
-                <w:u w:val="none"/>
-              </w:rPr>
-              <w:t>FE-02</w:t>
+            <w:shd w:val="clear" w:color="auto" w:fill="FFFFFF" w:themeFill="background1"/>
+            <w:tcMar>
+              <w:top w:w="90" w:type="dxa"/>
+              <w:left w:w="140" w:type="dxa"/>
+              <w:bottom w:w="90" w:type="dxa"/>
+              <w:right w:w="140" w:type="dxa"/>
+            </w:tcMar>
+            <w:vAlign w:val="top"/>
+          </w:tcPr>
+          <w:p>
+            <w:pPr>
+              <w:bidi w:val="0"/>
+              <w:spacing w:before="0" w:beforeAutospacing="off" w:after="0" w:afterAutospacing="off"/>
+            </w:pPr>
+            <w:r>
+              <w:rPr>
+                <w:rFonts w:ascii="Arial" w:hAnsi="Arial" w:eastAsia="Arial" w:cs="Arial"/>
+                <w:b w:val="0"/>
+                <w:bCs w:val="0"/>
+                <w:i w:val="0"/>
+                <w:iCs w:val="0"/>
+                <w:strike w:val="0"/>
+                <w:dstrike w:val="0"/>
+                <w:color w:val="000000" w:themeColor="text1" w:themeTint="FF" w:themeShade="FF"/>
+                <w:sz w:val="24"/>
+                <w:szCs w:val="24"/>
+                <w:u w:val="none"/>
+              </w:rPr>
+              <w:t xml:space="preserve">FE-02</w:t>
             </w:r>
           </w:p>
         </w:tc>
@@ -3199,35 +4149,35 @@
               <w:bottom w:val="single" w:color="AAAAAA" w:sz="6"/>
               <w:right w:val="single" w:color="AAAAAA" w:sz="6"/>
             </w:tcBorders>
-            <w:shd w:val="clear" w:color="auto" w:fill="DEEAF1"/>
-            <w:tcMar>
-              <w:top w:w="90" w:type="dxa"/>
-              <w:left w:w="140" w:type="dxa"/>
-              <w:bottom w:w="90" w:type="dxa"/>
-              <w:right w:w="140" w:type="dxa"/>
-            </w:tcMar>
-            <w:vAlign w:val="top"/>
-          </w:tcPr>
-          <w:p>
-            <w:pPr>
-              <w:bidi w:val="0"/>
-              <w:spacing w:before="0" w:beforeAutospacing="off" w:after="0" w:afterAutospacing="off"/>
-            </w:pPr>
-            <w:r>
-              <w:rPr>
-                <w:rFonts w:ascii="Arial" w:hAnsi="Arial" w:eastAsia="Arial" w:cs="Arial"/>
-                <w:b w:val="0"/>
-                <w:bCs w:val="0"/>
-                <w:i w:val="0"/>
-                <w:iCs w:val="0"/>
-                <w:strike w:val="0"/>
-                <w:dstrike w:val="0"/>
-                <w:color w:val="000000" w:themeColor="text1" w:themeTint="FF" w:themeShade="FF"/>
-                <w:sz w:val="24"/>
-                <w:szCs w:val="24"/>
-                <w:u w:val="none"/>
-              </w:rPr>
-              <w:t xml:space="preserve">Analyze Learning Weaknesses </w:t>
+            <w:shd w:val="clear" w:color="auto" w:fill="FFFFFF" w:themeFill="background1"/>
+            <w:tcMar>
+              <w:top w:w="90" w:type="dxa"/>
+              <w:left w:w="140" w:type="dxa"/>
+              <w:bottom w:w="90" w:type="dxa"/>
+              <w:right w:w="140" w:type="dxa"/>
+            </w:tcMar>
+            <w:vAlign w:val="top"/>
+          </w:tcPr>
+          <w:p>
+            <w:pPr>
+              <w:bidi w:val="0"/>
+              <w:spacing w:before="0" w:beforeAutospacing="off" w:after="0" w:afterAutospacing="off"/>
+            </w:pPr>
+            <w:r>
+              <w:rPr>
+                <w:rFonts w:ascii="Arial" w:hAnsi="Arial" w:eastAsia="Arial" w:cs="Arial"/>
+                <w:b w:val="0"/>
+                <w:bCs w:val="0"/>
+                <w:i w:val="0"/>
+                <w:iCs w:val="0"/>
+                <w:strike w:val="0"/>
+                <w:dstrike w:val="0"/>
+                <w:color w:val="000000" w:themeColor="text1" w:themeTint="FF" w:themeShade="FF"/>
+                <w:sz w:val="24"/>
+                <w:szCs w:val="24"/>
+                <w:u w:val="none"/>
+              </w:rPr>
+              <w:t xml:space="preserve">Band-Based Courses &amp; Multi-Skill Lessons</w:t>
             </w:r>
           </w:p>
         </w:tc>
@@ -3240,36 +4190,35 @@
               <w:bottom w:val="single" w:color="AAAAAA" w:sz="6"/>
               <w:right w:val="single" w:color="AAAAAA" w:sz="6"/>
             </w:tcBorders>
-            <w:shd w:val="clear" w:color="auto" w:fill="DEEAF1"/>
-            <w:tcMar>
-              <w:top w:w="90" w:type="dxa"/>
-              <w:left w:w="140" w:type="dxa"/>
-              <w:bottom w:w="90" w:type="dxa"/>
-              <w:right w:w="140" w:type="dxa"/>
-            </w:tcMar>
-            <w:vAlign w:val="top"/>
-          </w:tcPr>
-          <w:p>
-            <w:pPr>
-              <w:bidi w:val="0"/>
-              <w:spacing w:before="0" w:beforeAutospacing="off" w:after="0" w:afterAutospacing="off"/>
-            </w:pPr>
-            <w:r>
-              <w:rPr>
-                <w:rFonts w:ascii="Arial" w:hAnsi="Arial" w:eastAsia="Arial" w:cs="Arial"/>
-                <w:b w:val="0"/>
-                <w:bCs w:val="0"/>
-                <w:i w:val="0"/>
-                <w:iCs w:val="0"/>
-                <w:strike w:val="0"/>
-                <w:dstrike w:val="0"/>
-                <w:color w:val="000000" w:themeColor="text1" w:themeTint="FF" w:themeShade="FF"/>
-                <w:sz w:val="24"/>
-                <w:szCs w:val="24"/>
-                <w:u w:val="none"/>
-                <w:lang w:val="en-US"/>
-              </w:rPr>
-              <w:t>Analyzing practice results helps learners identify skills or areas for improvement and guides them towards the next steps in their review process.</w:t>
+            <w:shd w:val="clear" w:color="auto" w:fill="FFFFFF" w:themeFill="background1"/>
+            <w:tcMar>
+              <w:top w:w="90" w:type="dxa"/>
+              <w:left w:w="140" w:type="dxa"/>
+              <w:bottom w:w="90" w:type="dxa"/>
+              <w:right w:w="140" w:type="dxa"/>
+            </w:tcMar>
+            <w:vAlign w:val="top"/>
+          </w:tcPr>
+          <w:p>
+            <w:pPr>
+              <w:bidi w:val="0"/>
+              <w:spacing w:before="0" w:beforeAutospacing="off" w:after="0" w:afterAutospacing="off"/>
+            </w:pPr>
+            <w:r>
+              <w:rPr>
+                <w:rFonts w:ascii="Arial" w:hAnsi="Arial" w:eastAsia="Arial" w:cs="Arial"/>
+                <w:b w:val="0"/>
+                <w:bCs w:val="0"/>
+                <w:i w:val="0"/>
+                <w:iCs w:val="0"/>
+                <w:strike w:val="0"/>
+                <w:dstrike w:val="0"/>
+                <w:color w:val="000000" w:themeColor="text1" w:themeTint="FF" w:themeShade="FF"/>
+                <w:sz w:val="24"/>
+                <w:szCs w:val="24"/>
+                <w:u w:val="none"/>
+              </w:rPr>
+              <w:t xml:space="preserve">Courses by band contain topics and lessons with theory and exercises for Reading, Listening, Writing and Speaking.</w:t>
             </w:r>
           </w:p>
         </w:tc>
@@ -3282,35 +4231,35 @@
               <w:bottom w:val="single" w:color="AAAAAA" w:sz="6"/>
               <w:right w:val="single" w:color="AAAAAA" w:sz="6"/>
             </w:tcBorders>
-            <w:shd w:val="clear" w:color="auto" w:fill="DEEAF1"/>
-            <w:tcMar>
-              <w:top w:w="90" w:type="dxa"/>
-              <w:left w:w="140" w:type="dxa"/>
-              <w:bottom w:w="90" w:type="dxa"/>
-              <w:right w:w="140" w:type="dxa"/>
-            </w:tcMar>
-            <w:vAlign w:val="top"/>
-          </w:tcPr>
-          <w:p>
-            <w:pPr>
-              <w:bidi w:val="0"/>
-              <w:spacing w:before="0" w:beforeAutospacing="off" w:after="0" w:afterAutospacing="off"/>
-            </w:pPr>
-            <w:r>
-              <w:rPr>
-                <w:rFonts w:ascii="Arial" w:hAnsi="Arial" w:eastAsia="Arial" w:cs="Arial"/>
-                <w:b w:val="0"/>
-                <w:bCs w:val="0"/>
-                <w:i w:val="0"/>
-                <w:iCs w:val="0"/>
-                <w:strike w:val="0"/>
-                <w:dstrike w:val="0"/>
-                <w:color w:val="000000" w:themeColor="text1" w:themeTint="FF" w:themeShade="FF"/>
-                <w:sz w:val="24"/>
-                <w:szCs w:val="24"/>
-                <w:u w:val="none"/>
-              </w:rPr>
-              <w:t>GAP-02</w:t>
+            <w:shd w:val="clear" w:color="auto" w:fill="FFFFFF" w:themeFill="background1"/>
+            <w:tcMar>
+              <w:top w:w="90" w:type="dxa"/>
+              <w:left w:w="140" w:type="dxa"/>
+              <w:bottom w:w="90" w:type="dxa"/>
+              <w:right w:w="140" w:type="dxa"/>
+            </w:tcMar>
+            <w:vAlign w:val="top"/>
+          </w:tcPr>
+          <w:p>
+            <w:pPr>
+              <w:bidi w:val="0"/>
+              <w:spacing w:before="0" w:beforeAutospacing="off" w:after="0" w:afterAutospacing="off"/>
+            </w:pPr>
+            <w:r>
+              <w:rPr>
+                <w:rFonts w:ascii="Arial" w:hAnsi="Arial" w:eastAsia="Arial" w:cs="Arial"/>
+                <w:b w:val="0"/>
+                <w:bCs w:val="0"/>
+                <w:i w:val="0"/>
+                <w:iCs w:val="0"/>
+                <w:strike w:val="0"/>
+                <w:dstrike w:val="0"/>
+                <w:color w:val="000000" w:themeColor="text1" w:themeTint="FF" w:themeShade="FF"/>
+                <w:sz w:val="24"/>
+                <w:szCs w:val="24"/>
+                <w:u w:val="none"/>
+              </w:rPr>
+              <w:t xml:space="preserve">GAP-02, GAP-03</w:t>
             </w:r>
           </w:p>
         </w:tc>
@@ -3356,7 +4305,7 @@
                 <w:szCs w:val="24"/>
                 <w:u w:val="none"/>
               </w:rPr>
-              <w:t>FE-03</w:t>
+              <w:t xml:space="preserve">FE-03</w:t>
             </w:r>
           </w:p>
         </w:tc>
@@ -3397,7 +4346,7 @@
                 <w:szCs w:val="24"/>
                 <w:u w:val="none"/>
               </w:rPr>
-              <w:t xml:space="preserve">Host IELTS Competitions </w:t>
+              <w:t xml:space="preserve">Adaptive Practice &amp; Review</w:t>
             </w:r>
           </w:p>
         </w:tc>
@@ -3437,9 +4386,8 @@
                 <w:sz w:val="24"/>
                 <w:szCs w:val="24"/>
                 <w:u w:val="none"/>
-                <w:lang w:val="en-US"/>
-              </w:rPr>
-              <w:t>Creating opportunities for learners to participate in competitions during the preparation process helps to add purpose and challenge to their learning.</w:t>
+              </w:rPr>
+              <w:t xml:space="preserve">Practice results update mastery per knowledge point; weak points trigger targeted review sets and theory refreshers.</w:t>
             </w:r>
           </w:p>
         </w:tc>
@@ -3480,7 +4428,7 @@
                 <w:szCs w:val="24"/>
                 <w:u w:val="none"/>
               </w:rPr>
-              <w:t>GAP-03</w:t>
+              <w:t xml:space="preserve">GAP-01</w:t>
             </w:r>
           </w:p>
         </w:tc>
@@ -3498,35 +4446,35 @@
               <w:bottom w:val="single" w:color="AAAAAA" w:sz="6"/>
               <w:right w:val="single" w:color="AAAAAA" w:sz="6"/>
             </w:tcBorders>
-            <w:shd w:val="clear" w:color="auto" w:fill="DEEAF1"/>
-            <w:tcMar>
-              <w:top w:w="90" w:type="dxa"/>
-              <w:left w:w="140" w:type="dxa"/>
-              <w:bottom w:w="90" w:type="dxa"/>
-              <w:right w:w="140" w:type="dxa"/>
-            </w:tcMar>
-            <w:vAlign w:val="top"/>
-          </w:tcPr>
-          <w:p>
-            <w:pPr>
-              <w:bidi w:val="0"/>
-              <w:spacing w:before="0" w:beforeAutospacing="off" w:after="0" w:afterAutospacing="off"/>
-            </w:pPr>
-            <w:r>
-              <w:rPr>
-                <w:rFonts w:ascii="Arial" w:hAnsi="Arial" w:eastAsia="Arial" w:cs="Arial"/>
-                <w:b w:val="0"/>
-                <w:bCs w:val="0"/>
-                <w:i w:val="0"/>
-                <w:iCs w:val="0"/>
-                <w:strike w:val="0"/>
-                <w:dstrike w:val="0"/>
-                <w:color w:val="000000" w:themeColor="text1" w:themeTint="FF" w:themeShade="FF"/>
-                <w:sz w:val="24"/>
-                <w:szCs w:val="24"/>
-                <w:u w:val="none"/>
-              </w:rPr>
-              <w:t>FE-04</w:t>
+            <w:shd w:val="clear" w:color="auto" w:fill="FFFFFF" w:themeFill="background1"/>
+            <w:tcMar>
+              <w:top w:w="90" w:type="dxa"/>
+              <w:left w:w="140" w:type="dxa"/>
+              <w:bottom w:w="90" w:type="dxa"/>
+              <w:right w:w="140" w:type="dxa"/>
+            </w:tcMar>
+            <w:vAlign w:val="top"/>
+          </w:tcPr>
+          <w:p>
+            <w:pPr>
+              <w:bidi w:val="0"/>
+              <w:spacing w:before="0" w:beforeAutospacing="off" w:after="0" w:afterAutospacing="off"/>
+            </w:pPr>
+            <w:r>
+              <w:rPr>
+                <w:rFonts w:ascii="Arial" w:hAnsi="Arial" w:eastAsia="Arial" w:cs="Arial"/>
+                <w:b w:val="0"/>
+                <w:bCs w:val="0"/>
+                <w:i w:val="0"/>
+                <w:iCs w:val="0"/>
+                <w:strike w:val="0"/>
+                <w:dstrike w:val="0"/>
+                <w:color w:val="000000" w:themeColor="text1" w:themeTint="FF" w:themeShade="FF"/>
+                <w:sz w:val="24"/>
+                <w:szCs w:val="24"/>
+                <w:u w:val="none"/>
+              </w:rPr>
+              <w:t xml:space="preserve">FE-04</w:t>
             </w:r>
           </w:p>
         </w:tc>
@@ -3539,35 +4487,35 @@
               <w:bottom w:val="single" w:color="AAAAAA" w:sz="6"/>
               <w:right w:val="single" w:color="AAAAAA" w:sz="6"/>
             </w:tcBorders>
-            <w:shd w:val="clear" w:color="auto" w:fill="DEEAF1"/>
-            <w:tcMar>
-              <w:top w:w="90" w:type="dxa"/>
-              <w:left w:w="140" w:type="dxa"/>
-              <w:bottom w:w="90" w:type="dxa"/>
-              <w:right w:w="140" w:type="dxa"/>
-            </w:tcMar>
-            <w:vAlign w:val="top"/>
-          </w:tcPr>
-          <w:p>
-            <w:pPr>
-              <w:bidi w:val="0"/>
-              <w:spacing w:before="0" w:beforeAutospacing="off" w:after="0" w:afterAutospacing="off"/>
-            </w:pPr>
-            <w:r>
-              <w:rPr>
-                <w:rFonts w:ascii="Arial" w:hAnsi="Arial" w:eastAsia="Arial" w:cs="Arial"/>
-                <w:b w:val="0"/>
-                <w:bCs w:val="0"/>
-                <w:i w:val="0"/>
-                <w:iCs w:val="0"/>
-                <w:strike w:val="0"/>
-                <w:dstrike w:val="0"/>
-                <w:color w:val="000000" w:themeColor="text1" w:themeTint="FF" w:themeShade="FF"/>
-                <w:sz w:val="24"/>
-                <w:szCs w:val="24"/>
-                <w:u w:val="none"/>
-              </w:rPr>
-              <w:t xml:space="preserve">Create Learning Games </w:t>
+            <w:shd w:val="clear" w:color="auto" w:fill="FFFFFF" w:themeFill="background1"/>
+            <w:tcMar>
+              <w:top w:w="90" w:type="dxa"/>
+              <w:left w:w="140" w:type="dxa"/>
+              <w:bottom w:w="90" w:type="dxa"/>
+              <w:right w:w="140" w:type="dxa"/>
+            </w:tcMar>
+            <w:vAlign w:val="top"/>
+          </w:tcPr>
+          <w:p>
+            <w:pPr>
+              <w:bidi w:val="0"/>
+              <w:spacing w:before="0" w:beforeAutospacing="off" w:after="0" w:afterAutospacing="off"/>
+            </w:pPr>
+            <w:r>
+              <w:rPr>
+                <w:rFonts w:ascii="Arial" w:hAnsi="Arial" w:eastAsia="Arial" w:cs="Arial"/>
+                <w:b w:val="0"/>
+                <w:bCs w:val="0"/>
+                <w:i w:val="0"/>
+                <w:iCs w:val="0"/>
+                <w:strike w:val="0"/>
+                <w:dstrike w:val="0"/>
+                <w:color w:val="000000" w:themeColor="text1" w:themeTint="FF" w:themeShade="FF"/>
+                <w:sz w:val="24"/>
+                <w:szCs w:val="24"/>
+                <w:u w:val="none"/>
+              </w:rPr>
+              <w:t xml:space="preserve">AI Writing Feedback</w:t>
             </w:r>
           </w:p>
         </w:tc>
@@ -3580,36 +4528,35 @@
               <w:bottom w:val="single" w:color="AAAAAA" w:sz="6"/>
               <w:right w:val="single" w:color="AAAAAA" w:sz="6"/>
             </w:tcBorders>
-            <w:shd w:val="clear" w:color="auto" w:fill="DEEAF1"/>
-            <w:tcMar>
-              <w:top w:w="90" w:type="dxa"/>
-              <w:left w:w="140" w:type="dxa"/>
-              <w:bottom w:w="90" w:type="dxa"/>
-              <w:right w:w="140" w:type="dxa"/>
-            </w:tcMar>
-            <w:vAlign w:val="top"/>
-          </w:tcPr>
-          <w:p>
-            <w:pPr>
-              <w:bidi w:val="0"/>
-              <w:spacing w:before="0" w:beforeAutospacing="off" w:after="0" w:afterAutospacing="off"/>
-            </w:pPr>
-            <w:r>
-              <w:rPr>
-                <w:rFonts w:ascii="Arial" w:hAnsi="Arial" w:eastAsia="Arial" w:cs="Arial"/>
-                <w:b w:val="0"/>
-                <w:bCs w:val="0"/>
-                <w:i w:val="0"/>
-                <w:iCs w:val="0"/>
-                <w:strike w:val="0"/>
-                <w:dstrike w:val="0"/>
-                <w:color w:val="000000" w:themeColor="text1" w:themeTint="FF" w:themeShade="FF"/>
-                <w:sz w:val="24"/>
-                <w:szCs w:val="24"/>
-                <w:u w:val="none"/>
-                <w:lang w:val="en-US"/>
-              </w:rPr>
-              <w:t>Integrating games into learning activities makes the review process more engaging and encourages learners to return to the app or website frequently.</w:t>
+            <w:shd w:val="clear" w:color="auto" w:fill="FFFFFF" w:themeFill="background1"/>
+            <w:tcMar>
+              <w:top w:w="90" w:type="dxa"/>
+              <w:left w:w="140" w:type="dxa"/>
+              <w:bottom w:w="90" w:type="dxa"/>
+              <w:right w:w="140" w:type="dxa"/>
+            </w:tcMar>
+            <w:vAlign w:val="top"/>
+          </w:tcPr>
+          <w:p>
+            <w:pPr>
+              <w:bidi w:val="0"/>
+              <w:spacing w:before="0" w:beforeAutospacing="off" w:after="0" w:afterAutospacing="off"/>
+            </w:pPr>
+            <w:r>
+              <w:rPr>
+                <w:rFonts w:ascii="Arial" w:hAnsi="Arial" w:eastAsia="Arial" w:cs="Arial"/>
+                <w:b w:val="0"/>
+                <w:bCs w:val="0"/>
+                <w:i w:val="0"/>
+                <w:iCs w:val="0"/>
+                <w:strike w:val="0"/>
+                <w:dstrike w:val="0"/>
+                <w:color w:val="000000" w:themeColor="text1" w:themeTint="FF" w:themeShade="FF"/>
+                <w:sz w:val="24"/>
+                <w:szCs w:val="24"/>
+                <w:u w:val="none"/>
+              </w:rPr>
+              <w:t xml:space="preserve">Essays are graded by AI against the IELTS Writing criteria, with strengths and improvements for each criterion.</w:t>
             </w:r>
           </w:p>
         </w:tc>
@@ -3622,35 +4569,35 @@
               <w:bottom w:val="single" w:color="AAAAAA" w:sz="6"/>
               <w:right w:val="single" w:color="AAAAAA" w:sz="6"/>
             </w:tcBorders>
-            <w:shd w:val="clear" w:color="auto" w:fill="DEEAF1"/>
-            <w:tcMar>
-              <w:top w:w="90" w:type="dxa"/>
-              <w:left w:w="140" w:type="dxa"/>
-              <w:bottom w:w="90" w:type="dxa"/>
-              <w:right w:w="140" w:type="dxa"/>
-            </w:tcMar>
-            <w:vAlign w:val="top"/>
-          </w:tcPr>
-          <w:p>
-            <w:pPr>
-              <w:bidi w:val="0"/>
-              <w:spacing w:before="0" w:beforeAutospacing="off" w:after="0" w:afterAutospacing="off"/>
-            </w:pPr>
-            <w:r>
-              <w:rPr>
-                <w:rFonts w:ascii="Arial" w:hAnsi="Arial" w:eastAsia="Arial" w:cs="Arial"/>
-                <w:b w:val="0"/>
-                <w:bCs w:val="0"/>
-                <w:i w:val="0"/>
-                <w:iCs w:val="0"/>
-                <w:strike w:val="0"/>
-                <w:dstrike w:val="0"/>
-                <w:color w:val="000000" w:themeColor="text1" w:themeTint="FF" w:themeShade="FF"/>
-                <w:sz w:val="24"/>
-                <w:szCs w:val="24"/>
-                <w:u w:val="none"/>
-              </w:rPr>
-              <w:t xml:space="preserve">GAP-03 </w:t>
+            <w:shd w:val="clear" w:color="auto" w:fill="FFFFFF" w:themeFill="background1"/>
+            <w:tcMar>
+              <w:top w:w="90" w:type="dxa"/>
+              <w:left w:w="140" w:type="dxa"/>
+              <w:bottom w:w="90" w:type="dxa"/>
+              <w:right w:w="140" w:type="dxa"/>
+            </w:tcMar>
+            <w:vAlign w:val="top"/>
+          </w:tcPr>
+          <w:p>
+            <w:pPr>
+              <w:bidi w:val="0"/>
+              <w:spacing w:before="0" w:beforeAutospacing="off" w:after="0" w:afterAutospacing="off"/>
+            </w:pPr>
+            <w:r>
+              <w:rPr>
+                <w:rFonts w:ascii="Arial" w:hAnsi="Arial" w:eastAsia="Arial" w:cs="Arial"/>
+                <w:b w:val="0"/>
+                <w:bCs w:val="0"/>
+                <w:i w:val="0"/>
+                <w:iCs w:val="0"/>
+                <w:strike w:val="0"/>
+                <w:dstrike w:val="0"/>
+                <w:color w:val="000000" w:themeColor="text1" w:themeTint="FF" w:themeShade="FF"/>
+                <w:sz w:val="24"/>
+                <w:szCs w:val="24"/>
+                <w:u w:val="none"/>
+              </w:rPr>
+              <w:t xml:space="preserve">GAP-03</w:t>
             </w:r>
           </w:p>
         </w:tc>
@@ -3696,7 +4643,7 @@
                 <w:szCs w:val="24"/>
                 <w:u w:val="none"/>
               </w:rPr>
-              <w:t>FE-05</w:t>
+              <w:t xml:space="preserve">FE-05</w:t>
             </w:r>
           </w:p>
         </w:tc>
@@ -3737,7 +4684,7 @@
                 <w:szCs w:val="24"/>
                 <w:u w:val="none"/>
               </w:rPr>
-              <w:t xml:space="preserve">Learn Vocabulary Through Videos </w:t>
+              <w:t xml:space="preserve">Topic &amp; Course Tests with Progress Tracking</w:t>
             </w:r>
           </w:p>
         </w:tc>
@@ -3778,7 +4725,7 @@
                 <w:szCs w:val="24"/>
                 <w:u w:val="none"/>
               </w:rPr>
-              <w:t>It helps learners access and practice vocabulary in the context of videos, rather than just learning words in isolation.</w:t>
+              <w:t xml:space="preserve">Final tests close each topic and course; learners track mastery and progress over time.</w:t>
             </w:r>
           </w:p>
         </w:tc>
@@ -3819,7 +4766,1190 @@
                 <w:szCs w:val="24"/>
                 <w:u w:val="none"/>
               </w:rPr>
-              <w:t xml:space="preserve">GAP-04 </w:t>
+              <w:t xml:space="preserve">GAP-01, GAP-04</w:t>
+            </w:r>
+          </w:p>
+        </w:tc>
+      </w:tr>
+      <w:tr>
+        <w:trPr>
+          <w:trHeight w:val="300"/>
+        </w:trPr>
+        <w:tc>
+          <w:tcPr>
+            <w:tcW w:w="698" w:type="dxa"/>
+            <w:tcBorders>
+              <w:top w:val="single" w:color="AAAAAA" w:sz="6"/>
+              <w:left w:val="single" w:color="AAAAAA" w:sz="6"/>
+              <w:bottom w:val="single" w:color="AAAAAA" w:sz="6"/>
+              <w:right w:val="single" w:color="AAAAAA" w:sz="6"/>
+            </w:tcBorders>
+            <w:shd w:val="clear" w:color="auto" w:fill="FFFFFF" w:themeFill="background1"/>
+            <w:tcMar>
+              <w:top w:w="90" w:type="dxa"/>
+              <w:left w:w="140" w:type="dxa"/>
+              <w:bottom w:w="90" w:type="dxa"/>
+              <w:right w:w="140" w:type="dxa"/>
+            </w:tcMar>
+            <w:vAlign w:val="top"/>
+          </w:tcPr>
+          <w:p>
+            <w:pPr>
+              <w:bidi w:val="0"/>
+              <w:spacing w:before="0" w:beforeAutospacing="off" w:after="0" w:afterAutospacing="off"/>
+            </w:pPr>
+            <w:r>
+              <w:rPr>
+                <w:rFonts w:ascii="Arial" w:hAnsi="Arial" w:eastAsia="Arial" w:cs="Arial"/>
+                <w:b w:val="0"/>
+                <w:bCs w:val="0"/>
+                <w:i w:val="0"/>
+                <w:iCs w:val="0"/>
+                <w:strike w:val="0"/>
+                <w:dstrike w:val="0"/>
+                <w:color w:val="000000" w:themeColor="text1" w:themeTint="FF" w:themeShade="FF"/>
+                <w:sz w:val="24"/>
+                <w:szCs w:val="24"/>
+                <w:u w:val="none"/>
+              </w:rPr>
+              <w:t xml:space="preserve">FE-06</w:t>
+            </w:r>
+          </w:p>
+        </w:tc>
+        <w:tc>
+          <w:tcPr>
+            <w:tcW w:w="1718" w:type="dxa"/>
+            <w:tcBorders>
+              <w:top w:val="single" w:color="AAAAAA" w:sz="6"/>
+              <w:left w:val="single" w:color="AAAAAA" w:sz="6"/>
+              <w:bottom w:val="single" w:color="AAAAAA" w:sz="6"/>
+              <w:right w:val="single" w:color="AAAAAA" w:sz="6"/>
+            </w:tcBorders>
+            <w:shd w:val="clear" w:color="auto" w:fill="FFFFFF" w:themeFill="background1"/>
+            <w:tcMar>
+              <w:top w:w="90" w:type="dxa"/>
+              <w:left w:w="140" w:type="dxa"/>
+              <w:bottom w:w="90" w:type="dxa"/>
+              <w:right w:w="140" w:type="dxa"/>
+            </w:tcMar>
+            <w:vAlign w:val="top"/>
+          </w:tcPr>
+          <w:p>
+            <w:pPr>
+              <w:bidi w:val="0"/>
+              <w:spacing w:before="0" w:beforeAutospacing="off" w:after="0" w:afterAutospacing="off"/>
+            </w:pPr>
+            <w:r>
+              <w:rPr>
+                <w:rFonts w:ascii="Arial" w:hAnsi="Arial" w:eastAsia="Arial" w:cs="Arial"/>
+                <w:b w:val="0"/>
+                <w:bCs w:val="0"/>
+                <w:i w:val="0"/>
+                <w:iCs w:val="0"/>
+                <w:strike w:val="0"/>
+                <w:dstrike w:val="0"/>
+                <w:color w:val="000000" w:themeColor="text1" w:themeTint="FF" w:themeShade="FF"/>
+                <w:sz w:val="24"/>
+                <w:szCs w:val="24"/>
+                <w:u w:val="none"/>
+              </w:rPr>
+              <w:t xml:space="preserve">Learning Games &amp; Competitions</w:t>
+            </w:r>
+          </w:p>
+        </w:tc>
+        <w:tc>
+          <w:tcPr>
+            <w:tcW w:w="4328" w:type="dxa"/>
+            <w:tcBorders>
+              <w:top w:val="single" w:color="AAAAAA" w:sz="6"/>
+              <w:left w:val="single" w:color="AAAAAA" w:sz="6"/>
+              <w:bottom w:val="single" w:color="AAAAAA" w:sz="6"/>
+              <w:right w:val="single" w:color="AAAAAA" w:sz="6"/>
+            </w:tcBorders>
+            <w:shd w:val="clear" w:color="auto" w:fill="FFFFFF" w:themeFill="background1"/>
+            <w:tcMar>
+              <w:top w:w="90" w:type="dxa"/>
+              <w:left w:w="140" w:type="dxa"/>
+              <w:bottom w:w="90" w:type="dxa"/>
+              <w:right w:w="140" w:type="dxa"/>
+            </w:tcMar>
+            <w:vAlign w:val="top"/>
+          </w:tcPr>
+          <w:p>
+            <w:pPr>
+              <w:bidi w:val="0"/>
+              <w:spacing w:before="0" w:beforeAutospacing="off" w:after="0" w:afterAutospacing="off"/>
+            </w:pPr>
+            <w:r>
+              <w:rPr>
+                <w:rFonts w:ascii="Arial" w:hAnsi="Arial" w:eastAsia="Arial" w:cs="Arial"/>
+                <w:b w:val="0"/>
+                <w:bCs w:val="0"/>
+                <w:i w:val="0"/>
+                <w:iCs w:val="0"/>
+                <w:strike w:val="0"/>
+                <w:dstrike w:val="0"/>
+                <w:color w:val="000000" w:themeColor="text1" w:themeTint="FF" w:themeShade="FF"/>
+                <w:sz w:val="24"/>
+                <w:szCs w:val="24"/>
+                <w:u w:val="none"/>
+              </w:rPr>
+              <w:t xml:space="preserve">Real-time vocabulary and grammar games in rooms where learners compete with each other.</w:t>
+            </w:r>
+          </w:p>
+        </w:tc>
+        <w:tc>
+          <w:tcPr>
+            <w:tcW w:w="1778" w:type="dxa"/>
+            <w:tcBorders>
+              <w:top w:val="single" w:color="AAAAAA" w:sz="6"/>
+              <w:left w:val="single" w:color="AAAAAA" w:sz="6"/>
+              <w:bottom w:val="single" w:color="AAAAAA" w:sz="6"/>
+              <w:right w:val="single" w:color="AAAAAA" w:sz="6"/>
+            </w:tcBorders>
+            <w:shd w:val="clear" w:color="auto" w:fill="FFFFFF" w:themeFill="background1"/>
+            <w:tcMar>
+              <w:top w:w="90" w:type="dxa"/>
+              <w:left w:w="140" w:type="dxa"/>
+              <w:bottom w:w="90" w:type="dxa"/>
+              <w:right w:w="140" w:type="dxa"/>
+            </w:tcMar>
+            <w:vAlign w:val="top"/>
+          </w:tcPr>
+          <w:p>
+            <w:pPr>
+              <w:bidi w:val="0"/>
+              <w:spacing w:before="0" w:beforeAutospacing="off" w:after="0" w:afterAutospacing="off"/>
+            </w:pPr>
+            <w:r>
+              <w:rPr>
+                <w:rFonts w:ascii="Arial" w:hAnsi="Arial" w:eastAsia="Arial" w:cs="Arial"/>
+                <w:b w:val="0"/>
+                <w:bCs w:val="0"/>
+                <w:i w:val="0"/>
+                <w:iCs w:val="0"/>
+                <w:strike w:val="0"/>
+                <w:dstrike w:val="0"/>
+                <w:color w:val="000000" w:themeColor="text1" w:themeTint="FF" w:themeShade="FF"/>
+                <w:sz w:val="24"/>
+                <w:szCs w:val="24"/>
+                <w:u w:val="none"/>
+              </w:rPr>
+              <w:t xml:space="preserve">GAP-06</w:t>
+            </w:r>
+          </w:p>
+        </w:tc>
+      </w:tr>
+      <w:tr>
+        <w:trPr>
+          <w:trHeight w:val="300"/>
+        </w:trPr>
+        <w:tc>
+          <w:tcPr>
+            <w:tcW w:w="698" w:type="dxa"/>
+            <w:tcBorders>
+              <w:top w:val="single" w:color="AAAAAA" w:sz="6"/>
+              <w:left w:val="single" w:color="AAAAAA" w:sz="6"/>
+              <w:bottom w:val="single" w:color="AAAAAA" w:sz="6"/>
+              <w:right w:val="single" w:color="AAAAAA" w:sz="6"/>
+            </w:tcBorders>
+            <w:shd w:val="clear" w:color="auto" w:fill="FFFFFF" w:themeFill="background1"/>
+            <w:tcMar>
+              <w:top w:w="90" w:type="dxa"/>
+              <w:left w:w="140" w:type="dxa"/>
+              <w:bottom w:w="90" w:type="dxa"/>
+              <w:right w:w="140" w:type="dxa"/>
+            </w:tcMar>
+            <w:vAlign w:val="top"/>
+          </w:tcPr>
+          <w:p>
+            <w:pPr>
+              <w:bidi w:val="0"/>
+              <w:spacing w:before="0" w:beforeAutospacing="off" w:after="0" w:afterAutospacing="off"/>
+            </w:pPr>
+            <w:r>
+              <w:rPr>
+                <w:rFonts w:ascii="Arial" w:hAnsi="Arial" w:eastAsia="Arial" w:cs="Arial"/>
+                <w:b w:val="0"/>
+                <w:bCs w:val="0"/>
+                <w:i w:val="0"/>
+                <w:iCs w:val="0"/>
+                <w:strike w:val="0"/>
+                <w:dstrike w:val="0"/>
+                <w:color w:val="000000" w:themeColor="text1" w:themeTint="FF" w:themeShade="FF"/>
+                <w:sz w:val="24"/>
+                <w:szCs w:val="24"/>
+                <w:u w:val="none"/>
+              </w:rPr>
+              <w:t xml:space="preserve">FE-07</w:t>
+            </w:r>
+          </w:p>
+        </w:tc>
+        <w:tc>
+          <w:tcPr>
+            <w:tcW w:w="1718" w:type="dxa"/>
+            <w:tcBorders>
+              <w:top w:val="single" w:color="AAAAAA" w:sz="6"/>
+              <w:left w:val="single" w:color="AAAAAA" w:sz="6"/>
+              <w:bottom w:val="single" w:color="AAAAAA" w:sz="6"/>
+              <w:right w:val="single" w:color="AAAAAA" w:sz="6"/>
+            </w:tcBorders>
+            <w:shd w:val="clear" w:color="auto" w:fill="FFFFFF" w:themeFill="background1"/>
+            <w:tcMar>
+              <w:top w:w="90" w:type="dxa"/>
+              <w:left w:w="140" w:type="dxa"/>
+              <w:bottom w:w="90" w:type="dxa"/>
+              <w:right w:w="140" w:type="dxa"/>
+            </w:tcMar>
+            <w:vAlign w:val="top"/>
+          </w:tcPr>
+          <w:p>
+            <w:pPr>
+              <w:bidi w:val="0"/>
+              <w:spacing w:before="0" w:beforeAutospacing="off" w:after="0" w:afterAutospacing="off"/>
+            </w:pPr>
+            <w:r>
+              <w:rPr>
+                <w:rFonts w:ascii="Arial" w:hAnsi="Arial" w:eastAsia="Arial" w:cs="Arial"/>
+                <w:b w:val="0"/>
+                <w:bCs w:val="0"/>
+                <w:i w:val="0"/>
+                <w:iCs w:val="0"/>
+                <w:strike w:val="0"/>
+                <w:dstrike w:val="0"/>
+                <w:color w:val="000000" w:themeColor="text1" w:themeTint="FF" w:themeShade="FF"/>
+                <w:sz w:val="24"/>
+                <w:szCs w:val="24"/>
+                <w:u w:val="none"/>
+              </w:rPr>
+              <w:t xml:space="preserve">Vocabulary Through Videos &amp; Flashcards</w:t>
+            </w:r>
+          </w:p>
+        </w:tc>
+        <w:tc>
+          <w:tcPr>
+            <w:tcW w:w="4328" w:type="dxa"/>
+            <w:tcBorders>
+              <w:top w:val="single" w:color="AAAAAA" w:sz="6"/>
+              <w:left w:val="single" w:color="AAAAAA" w:sz="6"/>
+              <w:bottom w:val="single" w:color="AAAAAA" w:sz="6"/>
+              <w:right w:val="single" w:color="AAAAAA" w:sz="6"/>
+            </w:tcBorders>
+            <w:shd w:val="clear" w:color="auto" w:fill="FFFFFF" w:themeFill="background1"/>
+            <w:tcMar>
+              <w:top w:w="90" w:type="dxa"/>
+              <w:left w:w="140" w:type="dxa"/>
+              <w:bottom w:w="90" w:type="dxa"/>
+              <w:right w:w="140" w:type="dxa"/>
+            </w:tcMar>
+            <w:vAlign w:val="top"/>
+          </w:tcPr>
+          <w:p>
+            <w:pPr>
+              <w:bidi w:val="0"/>
+              <w:spacing w:before="0" w:beforeAutospacing="off" w:after="0" w:afterAutospacing="off"/>
+            </w:pPr>
+            <w:r>
+              <w:rPr>
+                <w:rFonts w:ascii="Arial" w:hAnsi="Arial" w:eastAsia="Arial" w:cs="Arial"/>
+                <w:b w:val="0"/>
+                <w:bCs w:val="0"/>
+                <w:i w:val="0"/>
+                <w:iCs w:val="0"/>
+                <w:strike w:val="0"/>
+                <w:dstrike w:val="0"/>
+                <w:color w:val="000000" w:themeColor="text1" w:themeTint="FF" w:themeShade="FF"/>
+                <w:sz w:val="24"/>
+                <w:szCs w:val="24"/>
+                <w:u w:val="none"/>
+              </w:rPr>
+              <w:t xml:space="preserve">Learners study vocabulary in video context, save segments, and review words with flashcard decks and notes.</w:t>
+            </w:r>
+          </w:p>
+        </w:tc>
+        <w:tc>
+          <w:tcPr>
+            <w:tcW w:w="1778" w:type="dxa"/>
+            <w:tcBorders>
+              <w:top w:val="single" w:color="AAAAAA" w:sz="6"/>
+              <w:left w:val="single" w:color="AAAAAA" w:sz="6"/>
+              <w:bottom w:val="single" w:color="AAAAAA" w:sz="6"/>
+              <w:right w:val="single" w:color="AAAAAA" w:sz="6"/>
+            </w:tcBorders>
+            <w:shd w:val="clear" w:color="auto" w:fill="FFFFFF" w:themeFill="background1"/>
+            <w:tcMar>
+              <w:top w:w="90" w:type="dxa"/>
+              <w:left w:w="140" w:type="dxa"/>
+              <w:bottom w:w="90" w:type="dxa"/>
+              <w:right w:w="140" w:type="dxa"/>
+            </w:tcMar>
+            <w:vAlign w:val="top"/>
+          </w:tcPr>
+          <w:p>
+            <w:pPr>
+              <w:bidi w:val="0"/>
+              <w:spacing w:before="0" w:beforeAutospacing="off" w:after="0" w:afterAutospacing="off"/>
+            </w:pPr>
+            <w:r>
+              <w:rPr>
+                <w:rFonts w:ascii="Arial" w:hAnsi="Arial" w:eastAsia="Arial" w:cs="Arial"/>
+                <w:b w:val="0"/>
+                <w:bCs w:val="0"/>
+                <w:i w:val="0"/>
+                <w:iCs w:val="0"/>
+                <w:strike w:val="0"/>
+                <w:dstrike w:val="0"/>
+                <w:color w:val="000000" w:themeColor="text1" w:themeTint="FF" w:themeShade="FF"/>
+                <w:sz w:val="24"/>
+                <w:szCs w:val="24"/>
+                <w:u w:val="none"/>
+              </w:rPr>
+              <w:t xml:space="preserve">GAP-07</w:t>
+            </w:r>
+          </w:p>
+        </w:tc>
+      </w:tr>
+      <w:tr>
+        <w:trPr>
+          <w:trHeight w:val="300"/>
+        </w:trPr>
+        <w:tc>
+          <w:tcPr>
+            <w:tcW w:w="698" w:type="dxa"/>
+            <w:tcBorders>
+              <w:top w:val="single" w:color="AAAAAA" w:sz="6"/>
+              <w:left w:val="single" w:color="AAAAAA" w:sz="6"/>
+              <w:bottom w:val="single" w:color="AAAAAA" w:sz="6"/>
+              <w:right w:val="single" w:color="AAAAAA" w:sz="6"/>
+            </w:tcBorders>
+            <w:shd w:val="clear" w:color="auto" w:fill="FFFFFF" w:themeFill="background1"/>
+            <w:tcMar>
+              <w:top w:w="90" w:type="dxa"/>
+              <w:left w:w="140" w:type="dxa"/>
+              <w:bottom w:w="90" w:type="dxa"/>
+              <w:right w:w="140" w:type="dxa"/>
+            </w:tcMar>
+            <w:vAlign w:val="top"/>
+          </w:tcPr>
+          <w:p>
+            <w:pPr>
+              <w:bidi w:val="0"/>
+              <w:spacing w:before="0" w:beforeAutospacing="off" w:after="0" w:afterAutospacing="off"/>
+            </w:pPr>
+            <w:r>
+              <w:rPr>
+                <w:rFonts w:ascii="Arial" w:hAnsi="Arial" w:eastAsia="Arial" w:cs="Arial"/>
+                <w:b w:val="0"/>
+                <w:bCs w:val="0"/>
+                <w:i w:val="0"/>
+                <w:iCs w:val="0"/>
+                <w:strike w:val="0"/>
+                <w:dstrike w:val="0"/>
+                <w:color w:val="000000" w:themeColor="text1" w:themeTint="FF" w:themeShade="FF"/>
+                <w:sz w:val="24"/>
+                <w:szCs w:val="24"/>
+                <w:u w:val="none"/>
+              </w:rPr>
+              <w:t xml:space="preserve">FE-08</w:t>
+            </w:r>
+          </w:p>
+        </w:tc>
+        <w:tc>
+          <w:tcPr>
+            <w:tcW w:w="1718" w:type="dxa"/>
+            <w:tcBorders>
+              <w:top w:val="single" w:color="AAAAAA" w:sz="6"/>
+              <w:left w:val="single" w:color="AAAAAA" w:sz="6"/>
+              <w:bottom w:val="single" w:color="AAAAAA" w:sz="6"/>
+              <w:right w:val="single" w:color="AAAAAA" w:sz="6"/>
+            </w:tcBorders>
+            <w:shd w:val="clear" w:color="auto" w:fill="FFFFFF" w:themeFill="background1"/>
+            <w:tcMar>
+              <w:top w:w="90" w:type="dxa"/>
+              <w:left w:w="140" w:type="dxa"/>
+              <w:bottom w:w="90" w:type="dxa"/>
+              <w:right w:w="140" w:type="dxa"/>
+            </w:tcMar>
+            <w:vAlign w:val="top"/>
+          </w:tcPr>
+          <w:p>
+            <w:pPr>
+              <w:bidi w:val="0"/>
+              <w:spacing w:before="0" w:beforeAutospacing="off" w:after="0" w:afterAutospacing="off"/>
+            </w:pPr>
+            <w:r>
+              <w:rPr>
+                <w:rFonts w:ascii="Arial" w:hAnsi="Arial" w:eastAsia="Arial" w:cs="Arial"/>
+                <w:b w:val="0"/>
+                <w:bCs w:val="0"/>
+                <w:i w:val="0"/>
+                <w:iCs w:val="0"/>
+                <w:strike w:val="0"/>
+                <w:dstrike w:val="0"/>
+                <w:color w:val="000000" w:themeColor="text1" w:themeTint="FF" w:themeShade="FF"/>
+                <w:sz w:val="24"/>
+                <w:szCs w:val="24"/>
+                <w:u w:val="none"/>
+              </w:rPr>
+              <w:t xml:space="preserve">Learner Community</w:t>
+            </w:r>
+          </w:p>
+        </w:tc>
+        <w:tc>
+          <w:tcPr>
+            <w:tcW w:w="4328" w:type="dxa"/>
+            <w:tcBorders>
+              <w:top w:val="single" w:color="AAAAAA" w:sz="6"/>
+              <w:left w:val="single" w:color="AAAAAA" w:sz="6"/>
+              <w:bottom w:val="single" w:color="AAAAAA" w:sz="6"/>
+              <w:right w:val="single" w:color="AAAAAA" w:sz="6"/>
+            </w:tcBorders>
+            <w:shd w:val="clear" w:color="auto" w:fill="FFFFFF" w:themeFill="background1"/>
+            <w:tcMar>
+              <w:top w:w="90" w:type="dxa"/>
+              <w:left w:w="140" w:type="dxa"/>
+              <w:bottom w:w="90" w:type="dxa"/>
+              <w:right w:w="140" w:type="dxa"/>
+            </w:tcMar>
+            <w:vAlign w:val="top"/>
+          </w:tcPr>
+          <w:p>
+            <w:pPr>
+              <w:bidi w:val="0"/>
+              <w:spacing w:before="0" w:beforeAutospacing="off" w:after="0" w:afterAutospacing="off"/>
+            </w:pPr>
+            <w:r>
+              <w:rPr>
+                <w:rFonts w:ascii="Arial" w:hAnsi="Arial" w:eastAsia="Arial" w:cs="Arial"/>
+                <w:b w:val="0"/>
+                <w:bCs w:val="0"/>
+                <w:i w:val="0"/>
+                <w:iCs w:val="0"/>
+                <w:strike w:val="0"/>
+                <w:dstrike w:val="0"/>
+                <w:color w:val="000000" w:themeColor="text1" w:themeTint="FF" w:themeShade="FF"/>
+                <w:sz w:val="24"/>
+                <w:szCs w:val="24"/>
+                <w:u w:val="none"/>
+              </w:rPr>
+              <w:t xml:space="preserve">Learners post questions and tips, comment and react; posts are moderated.</w:t>
+            </w:r>
+          </w:p>
+        </w:tc>
+        <w:tc>
+          <w:tcPr>
+            <w:tcW w:w="1778" w:type="dxa"/>
+            <w:tcBorders>
+              <w:top w:val="single" w:color="AAAAAA" w:sz="6"/>
+              <w:left w:val="single" w:color="AAAAAA" w:sz="6"/>
+              <w:bottom w:val="single" w:color="AAAAAA" w:sz="6"/>
+              <w:right w:val="single" w:color="AAAAAA" w:sz="6"/>
+            </w:tcBorders>
+            <w:shd w:val="clear" w:color="auto" w:fill="FFFFFF" w:themeFill="background1"/>
+            <w:tcMar>
+              <w:top w:w="90" w:type="dxa"/>
+              <w:left w:w="140" w:type="dxa"/>
+              <w:bottom w:w="90" w:type="dxa"/>
+              <w:right w:w="140" w:type="dxa"/>
+            </w:tcMar>
+            <w:vAlign w:val="top"/>
+          </w:tcPr>
+          <w:p>
+            <w:pPr>
+              <w:bidi w:val="0"/>
+              <w:spacing w:before="0" w:beforeAutospacing="off" w:after="0" w:afterAutospacing="off"/>
+            </w:pPr>
+            <w:r>
+              <w:rPr>
+                <w:rFonts w:ascii="Arial" w:hAnsi="Arial" w:eastAsia="Arial" w:cs="Arial"/>
+                <w:b w:val="0"/>
+                <w:bCs w:val="0"/>
+                <w:i w:val="0"/>
+                <w:iCs w:val="0"/>
+                <w:strike w:val="0"/>
+                <w:dstrike w:val="0"/>
+                <w:color w:val="000000" w:themeColor="text1" w:themeTint="FF" w:themeShade="FF"/>
+                <w:sz w:val="24"/>
+                <w:szCs w:val="24"/>
+                <w:u w:val="none"/>
+              </w:rPr>
+              <w:t xml:space="preserve">GAP-06</w:t>
+            </w:r>
+          </w:p>
+        </w:tc>
+      </w:tr>
+      <w:tr>
+        <w:trPr>
+          <w:trHeight w:val="300"/>
+        </w:trPr>
+        <w:tc>
+          <w:tcPr>
+            <w:tcW w:w="698" w:type="dxa"/>
+            <w:tcBorders>
+              <w:top w:val="single" w:color="AAAAAA" w:sz="6"/>
+              <w:left w:val="single" w:color="AAAAAA" w:sz="6"/>
+              <w:bottom w:val="single" w:color="AAAAAA" w:sz="6"/>
+              <w:right w:val="single" w:color="AAAAAA" w:sz="6"/>
+            </w:tcBorders>
+            <w:shd w:val="clear" w:color="auto" w:fill="FFFFFF" w:themeFill="background1"/>
+            <w:tcMar>
+              <w:top w:w="90" w:type="dxa"/>
+              <w:left w:w="140" w:type="dxa"/>
+              <w:bottom w:w="90" w:type="dxa"/>
+              <w:right w:w="140" w:type="dxa"/>
+            </w:tcMar>
+            <w:vAlign w:val="top"/>
+          </w:tcPr>
+          <w:p>
+            <w:pPr>
+              <w:bidi w:val="0"/>
+              <w:spacing w:before="0" w:beforeAutospacing="off" w:after="0" w:afterAutospacing="off"/>
+            </w:pPr>
+            <w:r>
+              <w:rPr>
+                <w:rFonts w:ascii="Arial" w:hAnsi="Arial" w:eastAsia="Arial" w:cs="Arial"/>
+                <w:b w:val="0"/>
+                <w:bCs w:val="0"/>
+                <w:i w:val="0"/>
+                <w:iCs w:val="0"/>
+                <w:strike w:val="0"/>
+                <w:dstrike w:val="0"/>
+                <w:color w:val="000000" w:themeColor="text1" w:themeTint="FF" w:themeShade="FF"/>
+                <w:sz w:val="24"/>
+                <w:szCs w:val="24"/>
+                <w:u w:val="none"/>
+              </w:rPr>
+              <w:t xml:space="preserve">FE-09</w:t>
+            </w:r>
+          </w:p>
+        </w:tc>
+        <w:tc>
+          <w:tcPr>
+            <w:tcW w:w="1718" w:type="dxa"/>
+            <w:tcBorders>
+              <w:top w:val="single" w:color="AAAAAA" w:sz="6"/>
+              <w:left w:val="single" w:color="AAAAAA" w:sz="6"/>
+              <w:bottom w:val="single" w:color="AAAAAA" w:sz="6"/>
+              <w:right w:val="single" w:color="AAAAAA" w:sz="6"/>
+            </w:tcBorders>
+            <w:shd w:val="clear" w:color="auto" w:fill="FFFFFF" w:themeFill="background1"/>
+            <w:tcMar>
+              <w:top w:w="90" w:type="dxa"/>
+              <w:left w:w="140" w:type="dxa"/>
+              <w:bottom w:w="90" w:type="dxa"/>
+              <w:right w:w="140" w:type="dxa"/>
+            </w:tcMar>
+            <w:vAlign w:val="top"/>
+          </w:tcPr>
+          <w:p>
+            <w:pPr>
+              <w:bidi w:val="0"/>
+              <w:spacing w:before="0" w:beforeAutospacing="off" w:after="0" w:afterAutospacing="off"/>
+            </w:pPr>
+            <w:r>
+              <w:rPr>
+                <w:rFonts w:ascii="Arial" w:hAnsi="Arial" w:eastAsia="Arial" w:cs="Arial"/>
+                <w:b w:val="0"/>
+                <w:bCs w:val="0"/>
+                <w:i w:val="0"/>
+                <w:iCs w:val="0"/>
+                <w:strike w:val="0"/>
+                <w:dstrike w:val="0"/>
+                <w:color w:val="000000" w:themeColor="text1" w:themeTint="FF" w:themeShade="FF"/>
+                <w:sz w:val="24"/>
+                <w:szCs w:val="24"/>
+                <w:u w:val="none"/>
+              </w:rPr>
+              <w:t xml:space="preserve">Mobile Learning App</w:t>
+            </w:r>
+          </w:p>
+        </w:tc>
+        <w:tc>
+          <w:tcPr>
+            <w:tcW w:w="4328" w:type="dxa"/>
+            <w:tcBorders>
+              <w:top w:val="single" w:color="AAAAAA" w:sz="6"/>
+              <w:left w:val="single" w:color="AAAAAA" w:sz="6"/>
+              <w:bottom w:val="single" w:color="AAAAAA" w:sz="6"/>
+              <w:right w:val="single" w:color="AAAAAA" w:sz="6"/>
+            </w:tcBorders>
+            <w:shd w:val="clear" w:color="auto" w:fill="FFFFFF" w:themeFill="background1"/>
+            <w:tcMar>
+              <w:top w:w="90" w:type="dxa"/>
+              <w:left w:w="140" w:type="dxa"/>
+              <w:bottom w:w="90" w:type="dxa"/>
+              <w:right w:w="140" w:type="dxa"/>
+            </w:tcMar>
+            <w:vAlign w:val="top"/>
+          </w:tcPr>
+          <w:p>
+            <w:pPr>
+              <w:bidi w:val="0"/>
+              <w:spacing w:before="0" w:beforeAutospacing="off" w:after="0" w:afterAutospacing="off"/>
+            </w:pPr>
+            <w:r>
+              <w:rPr>
+                <w:rFonts w:ascii="Arial" w:hAnsi="Arial" w:eastAsia="Arial" w:cs="Arial"/>
+                <w:b w:val="0"/>
+                <w:bCs w:val="0"/>
+                <w:i w:val="0"/>
+                <w:iCs w:val="0"/>
+                <w:strike w:val="0"/>
+                <w:dstrike w:val="0"/>
+                <w:color w:val="000000" w:themeColor="text1" w:themeTint="FF" w:themeShade="FF"/>
+                <w:sz w:val="24"/>
+                <w:szCs w:val="24"/>
+                <w:u w:val="none"/>
+              </w:rPr>
+              <w:t xml:space="preserve">Learners continue lessons, practice and vocabulary review on their phones.</w:t>
+            </w:r>
+          </w:p>
+        </w:tc>
+        <w:tc>
+          <w:tcPr>
+            <w:tcW w:w="1778" w:type="dxa"/>
+            <w:tcBorders>
+              <w:top w:val="single" w:color="AAAAAA" w:sz="6"/>
+              <w:left w:val="single" w:color="AAAAAA" w:sz="6"/>
+              <w:bottom w:val="single" w:color="AAAAAA" w:sz="6"/>
+              <w:right w:val="single" w:color="AAAAAA" w:sz="6"/>
+            </w:tcBorders>
+            <w:shd w:val="clear" w:color="auto" w:fill="FFFFFF" w:themeFill="background1"/>
+            <w:tcMar>
+              <w:top w:w="90" w:type="dxa"/>
+              <w:left w:w="140" w:type="dxa"/>
+              <w:bottom w:w="90" w:type="dxa"/>
+              <w:right w:w="140" w:type="dxa"/>
+            </w:tcMar>
+            <w:vAlign w:val="top"/>
+          </w:tcPr>
+          <w:p>
+            <w:pPr>
+              <w:bidi w:val="0"/>
+              <w:spacing w:before="0" w:beforeAutospacing="off" w:after="0" w:afterAutospacing="off"/>
+            </w:pPr>
+            <w:r>
+              <w:rPr>
+                <w:rFonts w:ascii="Arial" w:hAnsi="Arial" w:eastAsia="Arial" w:cs="Arial"/>
+                <w:b w:val="0"/>
+                <w:bCs w:val="0"/>
+                <w:i w:val="0"/>
+                <w:iCs w:val="0"/>
+                <w:strike w:val="0"/>
+                <w:dstrike w:val="0"/>
+                <w:color w:val="000000" w:themeColor="text1" w:themeTint="FF" w:themeShade="FF"/>
+                <w:sz w:val="24"/>
+                <w:szCs w:val="24"/>
+                <w:u w:val="none"/>
+              </w:rPr>
+              <w:t xml:space="preserve">GAP-04, GAP-06</w:t>
+            </w:r>
+          </w:p>
+        </w:tc>
+      </w:tr>
+      <w:tr>
+        <w:trPr>
+          <w:trHeight w:val="300"/>
+        </w:trPr>
+        <w:tc>
+          <w:tcPr>
+            <w:tcW w:w="698" w:type="dxa"/>
+            <w:tcBorders>
+              <w:top w:val="single" w:color="AAAAAA" w:sz="6"/>
+              <w:left w:val="single" w:color="AAAAAA" w:sz="6"/>
+              <w:bottom w:val="single" w:color="AAAAAA" w:sz="6"/>
+              <w:right w:val="single" w:color="AAAAAA" w:sz="6"/>
+            </w:tcBorders>
+            <w:shd w:val="clear" w:color="auto" w:fill="FFFFFF" w:themeFill="background1"/>
+            <w:tcMar>
+              <w:top w:w="90" w:type="dxa"/>
+              <w:left w:w="140" w:type="dxa"/>
+              <w:bottom w:w="90" w:type="dxa"/>
+              <w:right w:w="140" w:type="dxa"/>
+            </w:tcMar>
+            <w:vAlign w:val="top"/>
+          </w:tcPr>
+          <w:p>
+            <w:pPr>
+              <w:bidi w:val="0"/>
+              <w:spacing w:before="0" w:beforeAutospacing="off" w:after="0" w:afterAutospacing="off"/>
+            </w:pPr>
+            <w:r>
+              <w:rPr>
+                <w:rFonts w:ascii="Arial" w:hAnsi="Arial" w:eastAsia="Arial" w:cs="Arial"/>
+                <w:b w:val="0"/>
+                <w:bCs w:val="0"/>
+                <w:i w:val="0"/>
+                <w:iCs w:val="0"/>
+                <w:strike w:val="0"/>
+                <w:dstrike w:val="0"/>
+                <w:color w:val="000000" w:themeColor="text1" w:themeTint="FF" w:themeShade="FF"/>
+                <w:sz w:val="24"/>
+                <w:szCs w:val="24"/>
+                <w:u w:val="none"/>
+              </w:rPr>
+              <w:t xml:space="preserve">FE-10</w:t>
+            </w:r>
+          </w:p>
+        </w:tc>
+        <w:tc>
+          <w:tcPr>
+            <w:tcW w:w="1718" w:type="dxa"/>
+            <w:tcBorders>
+              <w:top w:val="single" w:color="AAAAAA" w:sz="6"/>
+              <w:left w:val="single" w:color="AAAAAA" w:sz="6"/>
+              <w:bottom w:val="single" w:color="AAAAAA" w:sz="6"/>
+              <w:right w:val="single" w:color="AAAAAA" w:sz="6"/>
+            </w:tcBorders>
+            <w:shd w:val="clear" w:color="auto" w:fill="FFFFFF" w:themeFill="background1"/>
+            <w:tcMar>
+              <w:top w:w="90" w:type="dxa"/>
+              <w:left w:w="140" w:type="dxa"/>
+              <w:bottom w:w="90" w:type="dxa"/>
+              <w:right w:w="140" w:type="dxa"/>
+            </w:tcMar>
+            <w:vAlign w:val="top"/>
+          </w:tcPr>
+          <w:p>
+            <w:pPr>
+              <w:bidi w:val="0"/>
+              <w:spacing w:before="0" w:beforeAutospacing="off" w:after="0" w:afterAutospacing="off"/>
+            </w:pPr>
+            <w:r>
+              <w:rPr>
+                <w:rFonts w:ascii="Arial" w:hAnsi="Arial" w:eastAsia="Arial" w:cs="Arial"/>
+                <w:b w:val="0"/>
+                <w:bCs w:val="0"/>
+                <w:i w:val="0"/>
+                <w:iCs w:val="0"/>
+                <w:strike w:val="0"/>
+                <w:dstrike w:val="0"/>
+                <w:color w:val="000000" w:themeColor="text1" w:themeTint="FF" w:themeShade="FF"/>
+                <w:sz w:val="24"/>
+                <w:szCs w:val="24"/>
+                <w:u w:val="none"/>
+              </w:rPr>
+              <w:t xml:space="preserve">Free Trial Content &amp; Premium Activation Cards</w:t>
+            </w:r>
+          </w:p>
+        </w:tc>
+        <w:tc>
+          <w:tcPr>
+            <w:tcW w:w="4328" w:type="dxa"/>
+            <w:tcBorders>
+              <w:top w:val="single" w:color="AAAAAA" w:sz="6"/>
+              <w:left w:val="single" w:color="AAAAAA" w:sz="6"/>
+              <w:bottom w:val="single" w:color="AAAAAA" w:sz="6"/>
+              <w:right w:val="single" w:color="AAAAAA" w:sz="6"/>
+            </w:tcBorders>
+            <w:shd w:val="clear" w:color="auto" w:fill="FFFFFF" w:themeFill="background1"/>
+            <w:tcMar>
+              <w:top w:w="90" w:type="dxa"/>
+              <w:left w:w="140" w:type="dxa"/>
+              <w:bottom w:w="90" w:type="dxa"/>
+              <w:right w:w="140" w:type="dxa"/>
+            </w:tcMar>
+            <w:vAlign w:val="top"/>
+          </w:tcPr>
+          <w:p>
+            <w:pPr>
+              <w:bidi w:val="0"/>
+              <w:spacing w:before="0" w:beforeAutospacing="off" w:after="0" w:afterAutospacing="off"/>
+            </w:pPr>
+            <w:r>
+              <w:rPr>
+                <w:rFonts w:ascii="Arial" w:hAnsi="Arial" w:eastAsia="Arial" w:cs="Arial"/>
+                <w:b w:val="0"/>
+                <w:bCs w:val="0"/>
+                <w:i w:val="0"/>
+                <w:iCs w:val="0"/>
+                <w:strike w:val="0"/>
+                <w:dstrike w:val="0"/>
+                <w:color w:val="000000" w:themeColor="text1" w:themeTint="FF" w:themeShade="FF"/>
+                <w:sz w:val="24"/>
+                <w:szCs w:val="24"/>
+                <w:u w:val="none"/>
+              </w:rPr>
+              <w:t xml:space="preserve">Free topics are open to everyone; sales staff distribute activation cards that unlock premium content, and the system logs who activated each card and when.</w:t>
+            </w:r>
+          </w:p>
+        </w:tc>
+        <w:tc>
+          <w:tcPr>
+            <w:tcW w:w="1778" w:type="dxa"/>
+            <w:tcBorders>
+              <w:top w:val="single" w:color="AAAAAA" w:sz="6"/>
+              <w:left w:val="single" w:color="AAAAAA" w:sz="6"/>
+              <w:bottom w:val="single" w:color="AAAAAA" w:sz="6"/>
+              <w:right w:val="single" w:color="AAAAAA" w:sz="6"/>
+            </w:tcBorders>
+            <w:shd w:val="clear" w:color="auto" w:fill="FFFFFF" w:themeFill="background1"/>
+            <w:tcMar>
+              <w:top w:w="90" w:type="dxa"/>
+              <w:left w:w="140" w:type="dxa"/>
+              <w:bottom w:w="90" w:type="dxa"/>
+              <w:right w:w="140" w:type="dxa"/>
+            </w:tcMar>
+            <w:vAlign w:val="top"/>
+          </w:tcPr>
+          <w:p>
+            <w:pPr>
+              <w:bidi w:val="0"/>
+              <w:spacing w:before="0" w:beforeAutospacing="off" w:after="0" w:afterAutospacing="off"/>
+            </w:pPr>
+            <w:r>
+              <w:rPr>
+                <w:rFonts w:ascii="Arial" w:hAnsi="Arial" w:eastAsia="Arial" w:cs="Arial"/>
+                <w:b w:val="0"/>
+                <w:bCs w:val="0"/>
+                <w:i w:val="0"/>
+                <w:iCs w:val="0"/>
+                <w:strike w:val="0"/>
+                <w:dstrike w:val="0"/>
+                <w:color w:val="000000" w:themeColor="text1" w:themeTint="FF" w:themeShade="FF"/>
+                <w:sz w:val="24"/>
+                <w:szCs w:val="24"/>
+                <w:u w:val="none"/>
+              </w:rPr>
+              <w:t xml:space="preserve">GAP-05</w:t>
+            </w:r>
+          </w:p>
+        </w:tc>
+      </w:tr>
+      <w:tr>
+        <w:trPr>
+          <w:trHeight w:val="300"/>
+        </w:trPr>
+        <w:tc>
+          <w:tcPr>
+            <w:tcW w:w="698" w:type="dxa"/>
+            <w:tcBorders>
+              <w:top w:val="single" w:color="AAAAAA" w:sz="6"/>
+              <w:left w:val="single" w:color="AAAAAA" w:sz="6"/>
+              <w:bottom w:val="single" w:color="AAAAAA" w:sz="6"/>
+              <w:right w:val="single" w:color="AAAAAA" w:sz="6"/>
+            </w:tcBorders>
+            <w:shd w:val="clear" w:color="auto" w:fill="FFFFFF" w:themeFill="background1"/>
+            <w:tcMar>
+              <w:top w:w="90" w:type="dxa"/>
+              <w:left w:w="140" w:type="dxa"/>
+              <w:bottom w:w="90" w:type="dxa"/>
+              <w:right w:w="140" w:type="dxa"/>
+            </w:tcMar>
+            <w:vAlign w:val="top"/>
+          </w:tcPr>
+          <w:p>
+            <w:pPr>
+              <w:bidi w:val="0"/>
+              <w:spacing w:before="0" w:beforeAutospacing="off" w:after="0" w:afterAutospacing="off"/>
+            </w:pPr>
+            <w:r>
+              <w:rPr>
+                <w:rFonts w:ascii="Arial" w:hAnsi="Arial" w:eastAsia="Arial" w:cs="Arial"/>
+                <w:b w:val="0"/>
+                <w:bCs w:val="0"/>
+                <w:i w:val="0"/>
+                <w:iCs w:val="0"/>
+                <w:strike w:val="0"/>
+                <w:dstrike w:val="0"/>
+                <w:color w:val="000000" w:themeColor="text1" w:themeTint="FF" w:themeShade="FF"/>
+                <w:sz w:val="24"/>
+                <w:szCs w:val="24"/>
+                <w:u w:val="none"/>
+              </w:rPr>
+              <w:t xml:space="preserve">FE-11</w:t>
+            </w:r>
+          </w:p>
+        </w:tc>
+        <w:tc>
+          <w:tcPr>
+            <w:tcW w:w="1718" w:type="dxa"/>
+            <w:tcBorders>
+              <w:top w:val="single" w:color="AAAAAA" w:sz="6"/>
+              <w:left w:val="single" w:color="AAAAAA" w:sz="6"/>
+              <w:bottom w:val="single" w:color="AAAAAA" w:sz="6"/>
+              <w:right w:val="single" w:color="AAAAAA" w:sz="6"/>
+            </w:tcBorders>
+            <w:shd w:val="clear" w:color="auto" w:fill="FFFFFF" w:themeFill="background1"/>
+            <w:tcMar>
+              <w:top w:w="90" w:type="dxa"/>
+              <w:left w:w="140" w:type="dxa"/>
+              <w:bottom w:w="90" w:type="dxa"/>
+              <w:right w:w="140" w:type="dxa"/>
+            </w:tcMar>
+            <w:vAlign w:val="top"/>
+          </w:tcPr>
+          <w:p>
+            <w:pPr>
+              <w:bidi w:val="0"/>
+              <w:spacing w:before="0" w:beforeAutospacing="off" w:after="0" w:afterAutospacing="off"/>
+            </w:pPr>
+            <w:r>
+              <w:rPr>
+                <w:rFonts w:ascii="Arial" w:hAnsi="Arial" w:eastAsia="Arial" w:cs="Arial"/>
+                <w:b w:val="0"/>
+                <w:bCs w:val="0"/>
+                <w:i w:val="0"/>
+                <w:iCs w:val="0"/>
+                <w:strike w:val="0"/>
+                <w:dstrike w:val="0"/>
+                <w:color w:val="000000" w:themeColor="text1" w:themeTint="FF" w:themeShade="FF"/>
+                <w:sz w:val="24"/>
+                <w:szCs w:val="24"/>
+                <w:u w:val="none"/>
+              </w:rPr>
+              <w:t xml:space="preserve">Speaking Practice &amp; AI Speaking Feedback</w:t>
+            </w:r>
+          </w:p>
+        </w:tc>
+        <w:tc>
+          <w:tcPr>
+            <w:tcW w:w="4328" w:type="dxa"/>
+            <w:tcBorders>
+              <w:top w:val="single" w:color="AAAAAA" w:sz="6"/>
+              <w:left w:val="single" w:color="AAAAAA" w:sz="6"/>
+              <w:bottom w:val="single" w:color="AAAAAA" w:sz="6"/>
+              <w:right w:val="single" w:color="AAAAAA" w:sz="6"/>
+            </w:tcBorders>
+            <w:shd w:val="clear" w:color="auto" w:fill="FFFFFF" w:themeFill="background1"/>
+            <w:tcMar>
+              <w:top w:w="90" w:type="dxa"/>
+              <w:left w:w="140" w:type="dxa"/>
+              <w:bottom w:w="90" w:type="dxa"/>
+              <w:right w:w="140" w:type="dxa"/>
+            </w:tcMar>
+            <w:vAlign w:val="top"/>
+          </w:tcPr>
+          <w:p>
+            <w:pPr>
+              <w:bidi w:val="0"/>
+              <w:spacing w:before="0" w:beforeAutospacing="off" w:after="0" w:afterAutospacing="off"/>
+            </w:pPr>
+            <w:r>
+              <w:rPr>
+                <w:rFonts w:ascii="Arial" w:hAnsi="Arial" w:eastAsia="Arial" w:cs="Arial"/>
+                <w:b w:val="0"/>
+                <w:bCs w:val="0"/>
+                <w:i w:val="0"/>
+                <w:iCs w:val="0"/>
+                <w:strike w:val="0"/>
+                <w:dstrike w:val="0"/>
+                <w:color w:val="000000" w:themeColor="text1" w:themeTint="FF" w:themeShade="FF"/>
+                <w:sz w:val="24"/>
+                <w:szCs w:val="24"/>
+                <w:u w:val="none"/>
+              </w:rPr>
+              <w:t xml:space="preserve">Learners record answers to IELTS Speaking tasks; AI scores them against the Speaking criteria with feedback on fluency, vocabulary, grammar and pronunciation.</w:t>
+            </w:r>
+          </w:p>
+        </w:tc>
+        <w:tc>
+          <w:tcPr>
+            <w:tcW w:w="1778" w:type="dxa"/>
+            <w:tcBorders>
+              <w:top w:val="single" w:color="AAAAAA" w:sz="6"/>
+              <w:left w:val="single" w:color="AAAAAA" w:sz="6"/>
+              <w:bottom w:val="single" w:color="AAAAAA" w:sz="6"/>
+              <w:right w:val="single" w:color="AAAAAA" w:sz="6"/>
+            </w:tcBorders>
+            <w:shd w:val="clear" w:color="auto" w:fill="FFFFFF" w:themeFill="background1"/>
+            <w:tcMar>
+              <w:top w:w="90" w:type="dxa"/>
+              <w:left w:w="140" w:type="dxa"/>
+              <w:bottom w:w="90" w:type="dxa"/>
+              <w:right w:w="140" w:type="dxa"/>
+            </w:tcMar>
+            <w:vAlign w:val="top"/>
+          </w:tcPr>
+          <w:p>
+            <w:pPr>
+              <w:bidi w:val="0"/>
+              <w:spacing w:before="0" w:beforeAutospacing="off" w:after="0" w:afterAutospacing="off"/>
+            </w:pPr>
+            <w:r>
+              <w:rPr>
+                <w:rFonts w:ascii="Arial" w:hAnsi="Arial" w:eastAsia="Arial" w:cs="Arial"/>
+                <w:b w:val="0"/>
+                <w:bCs w:val="0"/>
+                <w:i w:val="0"/>
+                <w:iCs w:val="0"/>
+                <w:strike w:val="0"/>
+                <w:dstrike w:val="0"/>
+                <w:color w:val="000000" w:themeColor="text1" w:themeTint="FF" w:themeShade="FF"/>
+                <w:sz w:val="24"/>
+                <w:szCs w:val="24"/>
+                <w:u w:val="none"/>
+              </w:rPr>
+              <w:t xml:space="preserve">GAP-03</w:t>
+            </w:r>
+          </w:p>
+        </w:tc>
+      </w:tr>
+      <w:tr>
+        <w:trPr>
+          <w:trHeight w:val="300"/>
+        </w:trPr>
+        <w:tc>
+          <w:tcPr>
+            <w:tcW w:w="698" w:type="dxa"/>
+            <w:tcBorders>
+              <w:top w:val="single" w:color="AAAAAA" w:sz="6"/>
+              <w:left w:val="single" w:color="AAAAAA" w:sz="6"/>
+              <w:bottom w:val="single" w:color="AAAAAA" w:sz="6"/>
+              <w:right w:val="single" w:color="AAAAAA" w:sz="6"/>
+            </w:tcBorders>
+            <w:shd w:val="clear" w:color="auto" w:fill="FFFFFF" w:themeFill="background1"/>
+            <w:tcMar>
+              <w:top w:w="90" w:type="dxa"/>
+              <w:left w:w="140" w:type="dxa"/>
+              <w:bottom w:w="90" w:type="dxa"/>
+              <w:right w:w="140" w:type="dxa"/>
+            </w:tcMar>
+            <w:vAlign w:val="top"/>
+          </w:tcPr>
+          <w:p>
+            <w:pPr>
+              <w:bidi w:val="0"/>
+              <w:spacing w:before="0" w:beforeAutospacing="off" w:after="0" w:afterAutospacing="off"/>
+            </w:pPr>
+            <w:r>
+              <w:rPr>
+                <w:rFonts w:ascii="Arial" w:hAnsi="Arial" w:eastAsia="Arial" w:cs="Arial"/>
+                <w:b w:val="0"/>
+                <w:bCs w:val="0"/>
+                <w:i w:val="0"/>
+                <w:iCs w:val="0"/>
+                <w:strike w:val="0"/>
+                <w:dstrike w:val="0"/>
+                <w:color w:val="000000" w:themeColor="text1" w:themeTint="FF" w:themeShade="FF"/>
+                <w:sz w:val="24"/>
+                <w:szCs w:val="24"/>
+                <w:u w:val="none"/>
+              </w:rPr>
+              <w:t xml:space="preserve">FE-12</w:t>
+            </w:r>
+          </w:p>
+        </w:tc>
+        <w:tc>
+          <w:tcPr>
+            <w:tcW w:w="1718" w:type="dxa"/>
+            <w:tcBorders>
+              <w:top w:val="single" w:color="AAAAAA" w:sz="6"/>
+              <w:left w:val="single" w:color="AAAAAA" w:sz="6"/>
+              <w:bottom w:val="single" w:color="AAAAAA" w:sz="6"/>
+              <w:right w:val="single" w:color="AAAAAA" w:sz="6"/>
+            </w:tcBorders>
+            <w:shd w:val="clear" w:color="auto" w:fill="FFFFFF" w:themeFill="background1"/>
+            <w:tcMar>
+              <w:top w:w="90" w:type="dxa"/>
+              <w:left w:w="140" w:type="dxa"/>
+              <w:bottom w:w="90" w:type="dxa"/>
+              <w:right w:w="140" w:type="dxa"/>
+            </w:tcMar>
+            <w:vAlign w:val="top"/>
+          </w:tcPr>
+          <w:p>
+            <w:pPr>
+              <w:bidi w:val="0"/>
+              <w:spacing w:before="0" w:beforeAutospacing="off" w:after="0" w:afterAutospacing="off"/>
+            </w:pPr>
+            <w:r>
+              <w:rPr>
+                <w:rFonts w:ascii="Arial" w:hAnsi="Arial" w:eastAsia="Arial" w:cs="Arial"/>
+                <w:b w:val="0"/>
+                <w:bCs w:val="0"/>
+                <w:i w:val="0"/>
+                <w:iCs w:val="0"/>
+                <w:strike w:val="0"/>
+                <w:dstrike w:val="0"/>
+                <w:color w:val="000000" w:themeColor="text1" w:themeTint="FF" w:themeShade="FF"/>
+                <w:sz w:val="24"/>
+                <w:szCs w:val="24"/>
+                <w:u w:val="none"/>
+              </w:rPr>
+              <w:t xml:space="preserve">Full IELTS Mock Test</w:t>
+            </w:r>
+          </w:p>
+        </w:tc>
+        <w:tc>
+          <w:tcPr>
+            <w:tcW w:w="4328" w:type="dxa"/>
+            <w:tcBorders>
+              <w:top w:val="single" w:color="AAAAAA" w:sz="6"/>
+              <w:left w:val="single" w:color="AAAAAA" w:sz="6"/>
+              <w:bottom w:val="single" w:color="AAAAAA" w:sz="6"/>
+              <w:right w:val="single" w:color="AAAAAA" w:sz="6"/>
+            </w:tcBorders>
+            <w:shd w:val="clear" w:color="auto" w:fill="FFFFFF" w:themeFill="background1"/>
+            <w:tcMar>
+              <w:top w:w="90" w:type="dxa"/>
+              <w:left w:w="140" w:type="dxa"/>
+              <w:bottom w:w="90" w:type="dxa"/>
+              <w:right w:w="140" w:type="dxa"/>
+            </w:tcMar>
+            <w:vAlign w:val="top"/>
+          </w:tcPr>
+          <w:p>
+            <w:pPr>
+              <w:bidi w:val="0"/>
+              <w:spacing w:before="0" w:beforeAutospacing="off" w:after="0" w:afterAutospacing="off"/>
+            </w:pPr>
+            <w:r>
+              <w:rPr>
+                <w:rFonts w:ascii="Arial" w:hAnsi="Arial" w:eastAsia="Arial" w:cs="Arial"/>
+                <w:b w:val="0"/>
+                <w:bCs w:val="0"/>
+                <w:i w:val="0"/>
+                <w:iCs w:val="0"/>
+                <w:strike w:val="0"/>
+                <w:dstrike w:val="0"/>
+                <w:color w:val="000000" w:themeColor="text1" w:themeTint="FF" w:themeShade="FF"/>
+                <w:sz w:val="24"/>
+                <w:szCs w:val="24"/>
+                <w:u w:val="none"/>
+              </w:rPr>
+              <w:t xml:space="preserve">A timed mock test covers all four skills; Reading and Listening are scored automatically and Writing and Speaking are graded by examiners.</w:t>
+            </w:r>
+          </w:p>
+        </w:tc>
+        <w:tc>
+          <w:tcPr>
+            <w:tcW w:w="1778" w:type="dxa"/>
+            <w:tcBorders>
+              <w:top w:val="single" w:color="AAAAAA" w:sz="6"/>
+              <w:left w:val="single" w:color="AAAAAA" w:sz="6"/>
+              <w:bottom w:val="single" w:color="AAAAAA" w:sz="6"/>
+              <w:right w:val="single" w:color="AAAAAA" w:sz="6"/>
+            </w:tcBorders>
+            <w:shd w:val="clear" w:color="auto" w:fill="FFFFFF" w:themeFill="background1"/>
+            <w:tcMar>
+              <w:top w:w="90" w:type="dxa"/>
+              <w:left w:w="140" w:type="dxa"/>
+              <w:bottom w:w="90" w:type="dxa"/>
+              <w:right w:w="140" w:type="dxa"/>
+            </w:tcMar>
+            <w:vAlign w:val="top"/>
+          </w:tcPr>
+          <w:p>
+            <w:pPr>
+              <w:bidi w:val="0"/>
+              <w:spacing w:before="0" w:beforeAutospacing="off" w:after="0" w:afterAutospacing="off"/>
+            </w:pPr>
+            <w:r>
+              <w:rPr>
+                <w:rFonts w:ascii="Arial" w:hAnsi="Arial" w:eastAsia="Arial" w:cs="Arial"/>
+                <w:b w:val="0"/>
+                <w:bCs w:val="0"/>
+                <w:i w:val="0"/>
+                <w:iCs w:val="0"/>
+                <w:strike w:val="0"/>
+                <w:dstrike w:val="0"/>
+                <w:color w:val="000000" w:themeColor="text1" w:themeTint="FF" w:themeShade="FF"/>
+                <w:sz w:val="24"/>
+                <w:szCs w:val="24"/>
+                <w:u w:val="none"/>
+              </w:rPr>
+              <w:t xml:space="preserve">GAP-03, GAP-04</w:t>
             </w:r>
           </w:p>
         </w:tc>
@@ -3852,7 +5982,7 @@
           <w:u w:val="none"/>
           <w:lang w:val="en"/>
         </w:rPr>
-        <w:t>+Addresses Gap</w:t>
+        <w:t xml:space="preserve">Gap references (defined in Section 2):</w:t>
       </w:r>
     </w:p>
     <w:p xmlns:wp14="http://schemas.microsoft.com/office/word/2010/wordml" wp14:textId="7C82E5E8">
@@ -3896,7 +6026,7 @@
           <w:u w:val="none"/>
           <w:lang w:val="en"/>
         </w:rPr>
-        <w:t>GAP-01: Learners need a learning path that is more suited to their individual level, goals, and progress.</w:t>
+        <w:t xml:space="preserve">GAP-01: Test results show scores but not the knowledge behind each mistake or what to study next.</w:t>
       </w:r>
     </w:p>
     <w:p xmlns:wp14="http://schemas.microsoft.com/office/word/2010/wordml" wp14:textId="4BD0D664">
@@ -3940,7 +6070,7 @@
           <w:u w:val="none"/>
           <w:lang w:val="en"/>
         </w:rPr>
-        <w:t>GAP-02: Based on your experience, the feedback after completing the test did not clearly explain the mistakes and areas for improvement.</w:t>
+        <w:t xml:space="preserve">GAP-02: Learners practise full tests without first learning the knowledge each question type requires.</w:t>
       </w:r>
     </w:p>
     <w:p xmlns:wp14="http://schemas.microsoft.com/office/word/2010/wordml" wp14:textId="39DA5F0C">
@@ -3984,7 +6114,7 @@
           <w:u w:val="none"/>
           <w:lang w:val="en-US"/>
         </w:rPr>
-        <w:t>GAP-03: Learners need additional motivation to maintain their studies and return to regular practice.</w:t>
+        <w:t xml:space="preserve">GAP-03: No IELTS path connects practice in all four skills with feedback on written and spoken answers against the IELTS criteria.</w:t>
       </w:r>
     </w:p>
     <w:p xmlns:wp14="http://schemas.microsoft.com/office/word/2010/wordml" wp14:textId="191C2154">
@@ -4028,13 +6158,22 @@
           <w:u w:val="none"/>
           <w:lang w:val="en-US"/>
         </w:rPr>
-        <w:t>GAP-04</w:t>
+        <w:t xml:space="preserve">GAP-04: Practice between classes leaves no record, so learners cannot see their progress across topics and courses or which knowledge points are still weak.</w:t>
       </w:r>
-      <w:r>
+    </w:p>
+    <w:p>
+      <w:pPr>
+        <w:pStyle w:val="ListParagraph"/>
+        <w:numPr>
+          <w:ilvl w:val="0"/>
+          <w:numId w:val="2"/>
+        </w:numPr>
+        <w:bidi w:val="0"/>
+        <w:spacing w:before="0" w:beforeAutospacing="off" w:after="0" w:afterAutospacing="off" w:lineRule="auto"/>
         <w:rPr>
           <w:rFonts w:ascii="Arial" w:hAnsi="Arial" w:eastAsia="Arial" w:cs="Arial"/>
-          <w:b w:val="1"/>
-          <w:bCs w:val="1"/>
+          <w:b w:val="0"/>
+          <w:bCs w:val="0"/>
           <w:i w:val="0"/>
           <w:iCs w:val="0"/>
           <w:strike w:val="0"/>
@@ -4046,8 +6185,7 @@
           <w:u w:val="none"/>
           <w:lang w:val="en-US"/>
         </w:rPr>
-        <w:t>:</w:t>
-      </w:r>
+      </w:pPr>
       <w:r>
         <w:rPr>
           <w:rFonts w:ascii="Arial" w:hAnsi="Arial" w:eastAsia="Arial" w:cs="Arial"/>
@@ -4064,7 +6202,95 @@
           <w:u w:val="none"/>
           <w:lang w:val="en-US"/>
         </w:rPr>
-        <w:t>Learners find it difficult to memorize and use vocabulary when learning words in isolation, without specific usage context.</w:t>
+        <w:t xml:space="preserve">GAP-05: New visitors cannot try the centre's teaching before enrolling, and enrolled students have no extra online content.</w:t>
+      </w:r>
+    </w:p>
+    <w:p>
+      <w:pPr>
+        <w:pStyle w:val="ListParagraph"/>
+        <w:numPr>
+          <w:ilvl w:val="0"/>
+          <w:numId w:val="2"/>
+        </w:numPr>
+        <w:bidi w:val="0"/>
+        <w:spacing w:before="0" w:beforeAutospacing="off" w:after="0" w:afterAutospacing="off" w:lineRule="auto"/>
+        <w:rPr>
+          <w:rFonts w:ascii="Arial" w:hAnsi="Arial" w:eastAsia="Arial" w:cs="Arial"/>
+          <w:b w:val="0"/>
+          <w:bCs w:val="0"/>
+          <w:i w:val="0"/>
+          <w:iCs w:val="0"/>
+          <w:strike w:val="0"/>
+          <w:dstrike w:val="0"/>
+          <w:noProof w:val="0"/>
+          <w:color w:val="000000" w:themeColor="text1" w:themeTint="FF" w:themeShade="FF"/>
+          <w:sz w:val="24"/>
+          <w:szCs w:val="24"/>
+          <w:u w:val="none"/>
+          <w:lang w:val="en-US"/>
+        </w:rPr>
+      </w:pPr>
+      <w:r>
+        <w:rPr>
+          <w:rFonts w:ascii="Arial" w:hAnsi="Arial" w:eastAsia="Arial" w:cs="Arial"/>
+          <w:b w:val="0"/>
+          <w:bCs w:val="0"/>
+          <w:i w:val="0"/>
+          <w:iCs w:val="0"/>
+          <w:strike w:val="0"/>
+          <w:dstrike w:val="0"/>
+          <w:noProof w:val="0"/>
+          <w:color w:val="000000" w:themeColor="text1" w:themeTint="FF" w:themeShade="FF"/>
+          <w:sz w:val="24"/>
+          <w:szCs w:val="24"/>
+          <w:u w:val="none"/>
+          <w:lang w:val="en-US"/>
+        </w:rPr>
+        <w:t xml:space="preserve">GAP-06: Learners practising alone lose motivation and have no community or activity that brings them back.</w:t>
+      </w:r>
+    </w:p>
+    <w:p>
+      <w:pPr>
+        <w:pStyle w:val="ListParagraph"/>
+        <w:numPr>
+          <w:ilvl w:val="0"/>
+          <w:numId w:val="2"/>
+        </w:numPr>
+        <w:bidi w:val="0"/>
+        <w:spacing w:before="0" w:beforeAutospacing="off" w:after="0" w:afterAutospacing="off" w:lineRule="auto"/>
+        <w:rPr>
+          <w:rFonts w:ascii="Arial" w:hAnsi="Arial" w:eastAsia="Arial" w:cs="Arial"/>
+          <w:b w:val="0"/>
+          <w:bCs w:val="0"/>
+          <w:i w:val="0"/>
+          <w:iCs w:val="0"/>
+          <w:strike w:val="0"/>
+          <w:dstrike w:val="0"/>
+          <w:noProof w:val="0"/>
+          <w:color w:val="000000" w:themeColor="text1" w:themeTint="FF" w:themeShade="FF"/>
+          <w:sz w:val="24"/>
+          <w:szCs w:val="24"/>
+          <w:u w:val="none"/>
+          <w:lang w:val="en-US"/>
+        </w:rPr>
+      </w:pPr>
+      <w:r>
+        <w:rPr>
+          <w:rFonts w:ascii="Arial" w:hAnsi="Arial" w:eastAsia="Arial" w:cs="Arial"/>
+          <w:b w:val="0"/>
+          <w:bCs w:val="0"/>
+          <w:i w:val="0"/>
+          <w:iCs w:val="0"/>
+          <w:strike w:val="0"/>
+          <w:dstrike w:val="0"/>
+          <w:noProof w:val="0"/>
+          <w:color w:val="000000" w:themeColor="text1" w:themeTint="FF" w:themeShade="FF"/>
+          <w:sz w:val="24"/>
+          <w:szCs w:val="24"/>
+          <w:u w:val="none"/>
+          <w:lang w:val="en-US"/>
+        </w:rPr>
+        <w:t xml:space="preserve">GAP-07: Vocabulary is learned from word lists without usage context or regular review.</w:t>
       </w:r>
     </w:p>
     <w:p xmlns:wp14="http://schemas.microsoft.com/office/word/2010/wordml" wp14:textId="4B359943">
@@ -4291,7 +6517,7 @@
                 <w:szCs w:val="24"/>
                 <w:u w:val="none"/>
               </w:rPr>
-              <w:t>LI-01</w:t>
+              <w:t xml:space="preserve">LI-01</w:t>
             </w:r>
           </w:p>
         </w:tc>
@@ -4332,7 +6558,7 @@
                 <w:szCs w:val="24"/>
                 <w:u w:val="none"/>
               </w:rPr>
-              <w:t xml:space="preserve">Native mobile app for iOS and Android </w:t>
+              <w:t xml:space="preserve">Online payment, invoicing and revenue reporting</w:t>
             </w:r>
           </w:p>
         </w:tc>
@@ -4373,7 +6599,7 @@
                 <w:szCs w:val="24"/>
                 <w:u w:val="none"/>
               </w:rPr>
-              <w:t xml:space="preserve">The current version will focus on the website. Mobile apps can be considered after the web experience has been tested with learners. </w:t>
+              <w:t xml:space="preserve">Premium access is granted through activation cards sold by sales staff; the system records card activations only and performs no accounting.</w:t>
             </w:r>
           </w:p>
         </w:tc>
@@ -4391,35 +6617,35 @@
               <w:bottom w:val="single" w:color="AAAAAA" w:sz="6"/>
               <w:right w:val="single" w:color="AAAAAA" w:sz="6"/>
             </w:tcBorders>
-            <w:shd w:val="clear" w:color="auto" w:fill="DEEAF1"/>
-            <w:tcMar>
-              <w:top w:w="90" w:type="dxa"/>
-              <w:left w:w="140" w:type="dxa"/>
-              <w:bottom w:w="90" w:type="dxa"/>
-              <w:right w:w="140" w:type="dxa"/>
-            </w:tcMar>
-            <w:vAlign w:val="top"/>
-          </w:tcPr>
-          <w:p>
-            <w:pPr>
-              <w:bidi w:val="0"/>
-              <w:spacing w:before="0" w:beforeAutospacing="off" w:after="0" w:afterAutospacing="off"/>
-            </w:pPr>
-            <w:r>
-              <w:rPr>
-                <w:rFonts w:ascii="Arial" w:hAnsi="Arial" w:eastAsia="Arial" w:cs="Arial"/>
-                <w:b w:val="0"/>
-                <w:bCs w:val="0"/>
-                <w:i w:val="0"/>
-                <w:iCs w:val="0"/>
-                <w:strike w:val="0"/>
-                <w:dstrike w:val="0"/>
-                <w:color w:val="000000" w:themeColor="text1" w:themeTint="FF" w:themeShade="FF"/>
-                <w:sz w:val="24"/>
-                <w:szCs w:val="24"/>
-                <w:u w:val="none"/>
-              </w:rPr>
-              <w:t>LI-02</w:t>
+            <w:shd w:val="clear" w:color="auto" w:fill="FFFFFF" w:themeFill="background1"/>
+            <w:tcMar>
+              <w:top w:w="90" w:type="dxa"/>
+              <w:left w:w="140" w:type="dxa"/>
+              <w:bottom w:w="90" w:type="dxa"/>
+              <w:right w:w="140" w:type="dxa"/>
+            </w:tcMar>
+            <w:vAlign w:val="top"/>
+          </w:tcPr>
+          <w:p>
+            <w:pPr>
+              <w:bidi w:val="0"/>
+              <w:spacing w:before="0" w:beforeAutospacing="off" w:after="0" w:afterAutospacing="off"/>
+            </w:pPr>
+            <w:r>
+              <w:rPr>
+                <w:rFonts w:ascii="Arial" w:hAnsi="Arial" w:eastAsia="Arial" w:cs="Arial"/>
+                <w:b w:val="0"/>
+                <w:bCs w:val="0"/>
+                <w:i w:val="0"/>
+                <w:iCs w:val="0"/>
+                <w:strike w:val="0"/>
+                <w:dstrike w:val="0"/>
+                <w:color w:val="000000" w:themeColor="text1" w:themeTint="FF" w:themeShade="FF"/>
+                <w:sz w:val="24"/>
+                <w:szCs w:val="24"/>
+                <w:u w:val="none"/>
+              </w:rPr>
+              <w:t xml:space="preserve">LI-02</w:t>
             </w:r>
           </w:p>
         </w:tc>
@@ -4432,35 +6658,35 @@
               <w:bottom w:val="single" w:color="AAAAAA" w:sz="6"/>
               <w:right w:val="single" w:color="AAAAAA" w:sz="6"/>
             </w:tcBorders>
-            <w:shd w:val="clear" w:color="auto" w:fill="DEEAF1"/>
-            <w:tcMar>
-              <w:top w:w="90" w:type="dxa"/>
-              <w:left w:w="140" w:type="dxa"/>
-              <w:bottom w:w="90" w:type="dxa"/>
-              <w:right w:w="140" w:type="dxa"/>
-            </w:tcMar>
-            <w:vAlign w:val="top"/>
-          </w:tcPr>
-          <w:p>
-            <w:pPr>
-              <w:bidi w:val="0"/>
-              <w:spacing w:before="0" w:beforeAutospacing="off" w:after="0" w:afterAutospacing="off"/>
-            </w:pPr>
-            <w:r>
-              <w:rPr>
-                <w:rFonts w:ascii="Arial" w:hAnsi="Arial" w:eastAsia="Arial" w:cs="Arial"/>
-                <w:b w:val="0"/>
-                <w:bCs w:val="0"/>
-                <w:i w:val="0"/>
-                <w:iCs w:val="0"/>
-                <w:strike w:val="0"/>
-                <w:dstrike w:val="0"/>
-                <w:color w:val="000000" w:themeColor="text1" w:themeTint="FF" w:themeShade="FF"/>
-                <w:sz w:val="24"/>
-                <w:szCs w:val="24"/>
-                <w:u w:val="none"/>
-              </w:rPr>
-              <w:t xml:space="preserve">AI-powered Speaking assessment </w:t>
+            <w:shd w:val="clear" w:color="auto" w:fill="FFFFFF" w:themeFill="background1"/>
+            <w:tcMar>
+              <w:top w:w="90" w:type="dxa"/>
+              <w:left w:w="140" w:type="dxa"/>
+              <w:bottom w:w="90" w:type="dxa"/>
+              <w:right w:w="140" w:type="dxa"/>
+            </w:tcMar>
+            <w:vAlign w:val="top"/>
+          </w:tcPr>
+          <w:p>
+            <w:pPr>
+              <w:bidi w:val="0"/>
+              <w:spacing w:before="0" w:beforeAutospacing="off" w:after="0" w:afterAutospacing="off"/>
+            </w:pPr>
+            <w:r>
+              <w:rPr>
+                <w:rFonts w:ascii="Arial" w:hAnsi="Arial" w:eastAsia="Arial" w:cs="Arial"/>
+                <w:b w:val="0"/>
+                <w:bCs w:val="0"/>
+                <w:i w:val="0"/>
+                <w:iCs w:val="0"/>
+                <w:strike w:val="0"/>
+                <w:dstrike w:val="0"/>
+                <w:color w:val="000000" w:themeColor="text1" w:themeTint="FF" w:themeShade="FF"/>
+                <w:sz w:val="24"/>
+                <w:szCs w:val="24"/>
+                <w:u w:val="none"/>
+              </w:rPr>
+              <w:t xml:space="preserve">Centre operations for in-person classes: timetables, rooms, attendance, tuition and teacher payroll</w:t>
             </w:r>
           </w:p>
         </w:tc>
@@ -4473,35 +6699,35 @@
               <w:bottom w:val="single" w:color="AAAAAA" w:sz="6"/>
               <w:right w:val="single" w:color="AAAAAA" w:sz="6"/>
             </w:tcBorders>
-            <w:shd w:val="clear" w:color="auto" w:fill="DEEAF1"/>
-            <w:tcMar>
-              <w:top w:w="90" w:type="dxa"/>
-              <w:left w:w="140" w:type="dxa"/>
-              <w:bottom w:w="90" w:type="dxa"/>
-              <w:right w:w="140" w:type="dxa"/>
-            </w:tcMar>
-            <w:vAlign w:val="top"/>
-          </w:tcPr>
-          <w:p>
-            <w:pPr>
-              <w:bidi w:val="0"/>
-              <w:spacing w:before="0" w:beforeAutospacing="off" w:after="0" w:afterAutospacing="off"/>
-            </w:pPr>
-            <w:r>
-              <w:rPr>
-                <w:rFonts w:ascii="Arial" w:hAnsi="Arial" w:eastAsia="Arial" w:cs="Arial"/>
-                <w:b w:val="0"/>
-                <w:bCs w:val="0"/>
-                <w:i w:val="0"/>
-                <w:iCs w:val="0"/>
-                <w:strike w:val="0"/>
-                <w:dstrike w:val="0"/>
-                <w:color w:val="000000" w:themeColor="text1" w:themeTint="FF" w:themeShade="FF"/>
-                <w:sz w:val="24"/>
-                <w:szCs w:val="24"/>
-                <w:u w:val="none"/>
-              </w:rPr>
-              <w:t xml:space="preserve">Reliable speech recognition and scoring need further development and validation. This feature is deferred to ensure feedback is trustworthy </w:t>
+            <w:shd w:val="clear" w:color="auto" w:fill="FFFFFF" w:themeFill="background1"/>
+            <w:tcMar>
+              <w:top w:w="90" w:type="dxa"/>
+              <w:left w:w="140" w:type="dxa"/>
+              <w:bottom w:w="90" w:type="dxa"/>
+              <w:right w:w="140" w:type="dxa"/>
+            </w:tcMar>
+            <w:vAlign w:val="top"/>
+          </w:tcPr>
+          <w:p>
+            <w:pPr>
+              <w:bidi w:val="0"/>
+              <w:spacing w:before="0" w:beforeAutospacing="off" w:after="0" w:afterAutospacing="off"/>
+            </w:pPr>
+            <w:r>
+              <w:rPr>
+                <w:rFonts w:ascii="Arial" w:hAnsi="Arial" w:eastAsia="Arial" w:cs="Arial"/>
+                <w:b w:val="0"/>
+                <w:bCs w:val="0"/>
+                <w:i w:val="0"/>
+                <w:iCs w:val="0"/>
+                <w:strike w:val="0"/>
+                <w:dstrike w:val="0"/>
+                <w:color w:val="000000" w:themeColor="text1" w:themeTint="FF" w:themeShade="FF"/>
+                <w:sz w:val="24"/>
+                <w:szCs w:val="24"/>
+                <w:u w:val="none"/>
+              </w:rPr>
+              <w:t xml:space="preserve">IELTS Space already runs these processes with its own staff and tools.</w:t>
             </w:r>
           </w:p>
         </w:tc>
@@ -4547,7 +6773,7 @@
                 <w:szCs w:val="24"/>
                 <w:u w:val="none"/>
               </w:rPr>
-              <w:t>LI-03</w:t>
+              <w:t xml:space="preserve">LI-03</w:t>
             </w:r>
           </w:p>
         </w:tc>
@@ -4588,7 +6814,7 @@
                 <w:szCs w:val="24"/>
                 <w:u w:val="none"/>
               </w:rPr>
-              <w:t xml:space="preserve">English-learning community </w:t>
+              <w:t xml:space="preserve">Live online classes and video lessons with teachers</w:t>
             </w:r>
           </w:p>
         </w:tc>
@@ -4628,9 +6854,8 @@
                 <w:sz w:val="24"/>
                 <w:szCs w:val="24"/>
                 <w:u w:val="none"/>
-                <w:lang w:val="en-US"/>
-              </w:rPr>
-              <w:t xml:space="preserve">A useful community requires enough active learners and ongoing moderation. It is deferred until the platform has an established user base. </w:t>
+              </w:rPr>
+              <w:t xml:space="preserve">The system is a self-practice channel; teacher-led lessons stay in the classroom.</w:t>
             </w:r>
           </w:p>
         </w:tc>
@@ -4676,7 +6901,7 @@
                 <w:szCs w:val="24"/>
                 <w:u w:val="none"/>
               </w:rPr>
-              <w:t>LI-04</w:t>
+              <w:t xml:space="preserve">LI-04</w:t>
             </w:r>
           </w:p>
         </w:tc>
@@ -4717,7 +6942,7 @@
                 <w:szCs w:val="24"/>
                 <w:u w:val="none"/>
               </w:rPr>
-              <w:t xml:space="preserve">Vocabulary flashcards </w:t>
+              <w:t xml:space="preserve">Official IELTS certification or guaranteed band scores</w:t>
             </w:r>
           </w:p>
         </w:tc>
@@ -4757,9 +6982,8 @@
                 <w:sz w:val="24"/>
                 <w:szCs w:val="24"/>
                 <w:u w:val="none"/>
-                <w:lang w:val="en-US"/>
-              </w:rPr>
-              <w:t xml:space="preserve">The current version focuses on learning vocabulary through videos. A dedicated flashcard and review system is deferred to keep the initial scope manageable </w:t>
+              </w:rPr>
+              <w:t xml:space="preserve">Mock test results are estimates for practice and do not replace the official IELTS test.</w:t>
             </w:r>
           </w:p>
         </w:tc>
@@ -4805,7 +7029,7 @@
                 <w:szCs w:val="24"/>
                 <w:u w:val="none"/>
               </w:rPr>
-              <w:t>LI-05</w:t>
+              <w:t xml:space="preserve">LI-05</w:t>
             </w:r>
           </w:p>
         </w:tc>
@@ -4846,7 +7070,7 @@
                 <w:szCs w:val="24"/>
                 <w:u w:val="none"/>
               </w:rPr>
-              <w:t xml:space="preserve">RAG-based IELTS assistant </w:t>
+              <w:t xml:space="preserve">RAG-based IELTS chatbot assistant</w:t>
             </w:r>
           </w:p>
         </w:tc>
@@ -4886,9 +7110,264 @@
                 <w:sz w:val="24"/>
                 <w:szCs w:val="24"/>
                 <w:u w:val="none"/>
-                <w:lang w:val="en-US"/>
-              </w:rPr>
-              <w:t xml:space="preserve">This requires a curated IELTS knowledge base and testing to ensure answers are grounded in reliable content. It is deferred until suitable content is available and answer quality can be validated. </w:t>
+              </w:rPr>
+              <w:t xml:space="preserve">Requires a curated IELTS knowledge base and testing to keep answers grounded in reliable content.</w:t>
+            </w:r>
+          </w:p>
+        </w:tc>
+      </w:tr>
+      <w:tr>
+        <w:trPr>
+          <w:trHeight w:val="300"/>
+        </w:trPr>
+        <w:tc>
+          <w:tcPr>
+            <w:tcW w:w="1253" w:type="dxa"/>
+            <w:tcBorders>
+              <w:top w:val="single" w:color="AAAAAA" w:sz="6"/>
+              <w:left w:val="single" w:color="AAAAAA" w:sz="6"/>
+              <w:bottom w:val="single" w:color="AAAAAA" w:sz="6"/>
+              <w:right w:val="single" w:color="AAAAAA" w:sz="6"/>
+            </w:tcBorders>
+            <w:shd w:val="clear" w:color="auto" w:fill="FFFFFF" w:themeFill="background1"/>
+            <w:tcMar>
+              <w:top w:w="90" w:type="dxa"/>
+              <w:left w:w="140" w:type="dxa"/>
+              <w:bottom w:w="90" w:type="dxa"/>
+              <w:right w:w="140" w:type="dxa"/>
+            </w:tcMar>
+            <w:vAlign w:val="top"/>
+          </w:tcPr>
+          <w:p>
+            <w:pPr>
+              <w:bidi w:val="0"/>
+              <w:spacing w:before="0" w:beforeAutospacing="off" w:after="0" w:afterAutospacing="off"/>
+            </w:pPr>
+            <w:r>
+              <w:rPr>
+                <w:rFonts w:ascii="Arial" w:hAnsi="Arial" w:eastAsia="Arial" w:cs="Arial"/>
+                <w:b w:val="0"/>
+                <w:bCs w:val="0"/>
+                <w:i w:val="0"/>
+                <w:iCs w:val="0"/>
+                <w:strike w:val="0"/>
+                <w:dstrike w:val="0"/>
+                <w:color w:val="000000" w:themeColor="text1" w:themeTint="FF" w:themeShade="FF"/>
+                <w:sz w:val="24"/>
+                <w:szCs w:val="24"/>
+                <w:u w:val="none"/>
+              </w:rPr>
+              <w:t xml:space="preserve">LI-06</w:t>
+            </w:r>
+          </w:p>
+        </w:tc>
+        <w:tc>
+          <w:tcPr>
+            <w:tcW w:w="3353" w:type="dxa"/>
+            <w:tcBorders>
+              <w:top w:val="single" w:color="AAAAAA" w:sz="6"/>
+              <w:left w:val="single" w:color="AAAAAA" w:sz="6"/>
+              <w:bottom w:val="single" w:color="AAAAAA" w:sz="6"/>
+              <w:right w:val="single" w:color="AAAAAA" w:sz="6"/>
+            </w:tcBorders>
+            <w:shd w:val="clear" w:color="auto" w:fill="FFFFFF" w:themeFill="background1"/>
+            <w:tcMar>
+              <w:top w:w="90" w:type="dxa"/>
+              <w:left w:w="140" w:type="dxa"/>
+              <w:bottom w:w="90" w:type="dxa"/>
+              <w:right w:w="140" w:type="dxa"/>
+            </w:tcMar>
+            <w:vAlign w:val="top"/>
+          </w:tcPr>
+          <w:p>
+            <w:pPr>
+              <w:bidi w:val="0"/>
+              <w:spacing w:before="0" w:beforeAutospacing="off" w:after="0" w:afterAutospacing="off"/>
+            </w:pPr>
+            <w:r>
+              <w:rPr>
+                <w:rFonts w:ascii="Arial" w:hAnsi="Arial" w:eastAsia="Arial" w:cs="Arial"/>
+                <w:b w:val="0"/>
+                <w:bCs w:val="0"/>
+                <w:i w:val="0"/>
+                <w:iCs w:val="0"/>
+                <w:strike w:val="0"/>
+                <w:dstrike w:val="0"/>
+                <w:color w:val="000000" w:themeColor="text1" w:themeTint="FF" w:themeShade="FF"/>
+                <w:sz w:val="24"/>
+                <w:szCs w:val="24"/>
+                <w:u w:val="none"/>
+              </w:rPr>
+              <w:t xml:space="preserve">Use by other centres (multi-centre or franchise)</w:t>
+            </w:r>
+          </w:p>
+        </w:tc>
+        <w:tc>
+          <w:tcPr>
+            <w:tcW w:w="4433" w:type="dxa"/>
+            <w:tcBorders>
+              <w:top w:val="single" w:color="AAAAAA" w:sz="6"/>
+              <w:left w:val="single" w:color="AAAAAA" w:sz="6"/>
+              <w:bottom w:val="single" w:color="AAAAAA" w:sz="6"/>
+              <w:right w:val="single" w:color="AAAAAA" w:sz="6"/>
+            </w:tcBorders>
+            <w:shd w:val="clear" w:color="auto" w:fill="FFFFFF" w:themeFill="background1"/>
+            <w:tcMar>
+              <w:top w:w="90" w:type="dxa"/>
+              <w:left w:w="140" w:type="dxa"/>
+              <w:bottom w:w="90" w:type="dxa"/>
+              <w:right w:w="140" w:type="dxa"/>
+            </w:tcMar>
+            <w:vAlign w:val="top"/>
+          </w:tcPr>
+          <w:p>
+            <w:pPr>
+              <w:bidi w:val="0"/>
+              <w:spacing w:before="0" w:beforeAutospacing="off" w:after="0" w:afterAutospacing="off"/>
+            </w:pPr>
+            <w:r>
+              <w:rPr>
+                <w:rFonts w:ascii="Arial" w:hAnsi="Arial" w:eastAsia="Arial" w:cs="Arial"/>
+                <w:b w:val="0"/>
+                <w:bCs w:val="0"/>
+                <w:i w:val="0"/>
+                <w:iCs w:val="0"/>
+                <w:strike w:val="0"/>
+                <w:dstrike w:val="0"/>
+                <w:color w:val="000000" w:themeColor="text1" w:themeTint="FF" w:themeShade="FF"/>
+                <w:sz w:val="24"/>
+                <w:szCs w:val="24"/>
+                <w:u w:val="none"/>
+              </w:rPr>
+              <w:t xml:space="preserve">The system is built for IELTS Space only; supporting several centres needs separate data, branding and administration for each.</w:t>
+            </w:r>
+          </w:p>
+        </w:tc>
+      </w:tr>
+      <w:tr>
+        <w:trPr>
+          <w:trHeight w:val="300"/>
+        </w:trPr>
+        <w:tc>
+          <w:tcPr>
+            <w:tcW w:w="1253" w:type="dxa"/>
+            <w:tcBorders>
+              <w:top w:val="single" w:color="AAAAAA" w:sz="6"/>
+              <w:left w:val="single" w:color="AAAAAA" w:sz="6"/>
+              <w:bottom w:val="single" w:color="AAAAAA" w:sz="6"/>
+              <w:right w:val="single" w:color="AAAAAA" w:sz="6"/>
+            </w:tcBorders>
+            <w:shd w:val="clear" w:color="auto" w:fill="FFFFFF" w:themeFill="background1"/>
+            <w:tcMar>
+              <w:top w:w="90" w:type="dxa"/>
+              <w:left w:w="140" w:type="dxa"/>
+              <w:bottom w:w="90" w:type="dxa"/>
+              <w:right w:w="140" w:type="dxa"/>
+            </w:tcMar>
+            <w:vAlign w:val="top"/>
+          </w:tcPr>
+          <w:p>
+            <w:pPr>
+              <w:bidi w:val="0"/>
+              <w:spacing w:before="0" w:beforeAutospacing="off" w:after="0" w:afterAutospacing="off"/>
+            </w:pPr>
+            <w:r>
+              <w:rPr>
+                <w:rFonts w:ascii="Arial" w:hAnsi="Arial" w:eastAsia="Arial" w:cs="Arial"/>
+                <w:b w:val="0"/>
+                <w:bCs w:val="0"/>
+                <w:i w:val="0"/>
+                <w:iCs w:val="0"/>
+                <w:strike w:val="0"/>
+                <w:dstrike w:val="0"/>
+                <w:color w:val="000000" w:themeColor="text1" w:themeTint="FF" w:themeShade="FF"/>
+                <w:sz w:val="24"/>
+                <w:szCs w:val="24"/>
+                <w:u w:val="none"/>
+              </w:rPr>
+              <w:t xml:space="preserve">LI-07</w:t>
+            </w:r>
+          </w:p>
+        </w:tc>
+        <w:tc>
+          <w:tcPr>
+            <w:tcW w:w="3353" w:type="dxa"/>
+            <w:tcBorders>
+              <w:top w:val="single" w:color="AAAAAA" w:sz="6"/>
+              <w:left w:val="single" w:color="AAAAAA" w:sz="6"/>
+              <w:bottom w:val="single" w:color="AAAAAA" w:sz="6"/>
+              <w:right w:val="single" w:color="AAAAAA" w:sz="6"/>
+            </w:tcBorders>
+            <w:shd w:val="clear" w:color="auto" w:fill="FFFFFF" w:themeFill="background1"/>
+            <w:tcMar>
+              <w:top w:w="90" w:type="dxa"/>
+              <w:left w:w="140" w:type="dxa"/>
+              <w:bottom w:w="90" w:type="dxa"/>
+              <w:right w:w="140" w:type="dxa"/>
+            </w:tcMar>
+            <w:vAlign w:val="top"/>
+          </w:tcPr>
+          <w:p>
+            <w:pPr>
+              <w:bidi w:val="0"/>
+              <w:spacing w:before="0" w:beforeAutospacing="off" w:after="0" w:afterAutospacing="off"/>
+            </w:pPr>
+            <w:r>
+              <w:rPr>
+                <w:rFonts w:ascii="Arial" w:hAnsi="Arial" w:eastAsia="Arial" w:cs="Arial"/>
+                <w:b w:val="0"/>
+                <w:bCs w:val="0"/>
+                <w:i w:val="0"/>
+                <w:iCs w:val="0"/>
+                <w:strike w:val="0"/>
+                <w:dstrike w:val="0"/>
+                <w:color w:val="000000" w:themeColor="text1" w:themeTint="FF" w:themeShade="FF"/>
+                <w:sz w:val="24"/>
+                <w:szCs w:val="24"/>
+                <w:u w:val="none"/>
+              </w:rPr>
+              <w:t xml:space="preserve">Teacher dashboards and online class management</w:t>
+            </w:r>
+          </w:p>
+        </w:tc>
+        <w:tc>
+          <w:tcPr>
+            <w:tcW w:w="4433" w:type="dxa"/>
+            <w:tcBorders>
+              <w:top w:val="single" w:color="AAAAAA" w:sz="6"/>
+              <w:left w:val="single" w:color="AAAAAA" w:sz="6"/>
+              <w:bottom w:val="single" w:color="AAAAAA" w:sz="6"/>
+              <w:right w:val="single" w:color="AAAAAA" w:sz="6"/>
+            </w:tcBorders>
+            <w:shd w:val="clear" w:color="auto" w:fill="FFFFFF" w:themeFill="background1"/>
+            <w:tcMar>
+              <w:top w:w="90" w:type="dxa"/>
+              <w:left w:w="140" w:type="dxa"/>
+              <w:bottom w:w="90" w:type="dxa"/>
+              <w:right w:w="140" w:type="dxa"/>
+            </w:tcMar>
+            <w:vAlign w:val="top"/>
+          </w:tcPr>
+          <w:p>
+            <w:pPr>
+              <w:bidi w:val="0"/>
+              <w:spacing w:before="0" w:beforeAutospacing="off" w:after="0" w:afterAutospacing="off"/>
+            </w:pPr>
+            <w:r>
+              <w:rPr>
+                <w:rFonts w:ascii="Arial" w:hAnsi="Arial" w:eastAsia="Arial" w:cs="Arial"/>
+                <w:b w:val="0"/>
+                <w:bCs w:val="0"/>
+                <w:i w:val="0"/>
+                <w:iCs w:val="0"/>
+                <w:strike w:val="0"/>
+                <w:dstrike w:val="0"/>
+                <w:color w:val="000000" w:themeColor="text1" w:themeTint="FF" w:themeShade="FF"/>
+                <w:sz w:val="24"/>
+                <w:szCs w:val="24"/>
+                <w:u w:val="none"/>
+              </w:rPr>
+              <w:t xml:space="preserve">Learners see their own progress and weak knowledge points; teacher-facing class views need a separate teacher role and are planned for a later version.</w:t>
             </w:r>
           </w:p>
         </w:tc>
@@ -4971,7 +7450,7 @@
           <w:u w:val="none"/>
           <w:lang w:val="en-US"/>
         </w:rPr>
-        <w:t>The project is expected to add to IELTS Space a support channel for students outside of class hours, helping them continue their studies at a time that fits their personal schedule. Through this channel, students can reinforce what they have learned in class, maintain their practice habits, and track their progress between lessons.</w:t>
+        <w:t xml:space="preserve">IELTSPath gives IELTS Space two new channels. For acquisition, free topics let new visitors experience the centre's teaching before enrolling; the target is that at least 25% of learners who use the free content enrol in a course within one month, measured by the centre. For retention, current and waiting-list students keep practising between classes and see their own progress and weak knowledge points; the target is that at least 60% of enrolled students practise on IELTSPath in any given week. Sales staff answer activation-card enquiries directly from the activation log, which records who activated each card and when, without any accounting work.</w:t>
       </w:r>
     </w:p>
     <w:p xmlns:wp14="http://schemas.microsoft.com/office/word/2010/wordml" wp14:textId="63318883">
@@ -5020,7 +7499,7 @@
           <w:u w:val="none"/>
           <w:lang w:val="en-US"/>
         </w:rPr>
-        <w:t>IELTS learners are expected to have a clear and easily followable study plan. Understanding areas for improvement and what to study next reduces the time spent guessing and allows for more efficient use of study time. Tracking progress in IELTS skills helps them recognize improvements, adjust their study efforts, and maintain motivation throughout the preparation process. For those studying IELTS while also working or studying, this can help them better fit their daily schedules into their self-study time.</w:t>
+        <w:t xml:space="preserve">IELTS learners get a clear study plan that is easy to follow. Knowing their weak points and what to study next reduces guesswork and makes better use of study time. Tracking progress across topics and courses helps them see improvement, adjust their effort and stay motivated, on the web or on their phones. New visitors can try lessons for free before deciding to enrol. For learners who study IELTS alongside work or school, short lessons and practice sets fit into their daily schedule.</w:t>
       </w:r>
     </w:p>
     <w:p xmlns:wp14="http://schemas.microsoft.com/office/word/2010/wordml" wp14:textId="71B261D5">
@@ -5075,7 +7554,7 @@
           <w:u w:val="none"/>
           <w:lang w:val="en-US"/>
         </w:rPr>
-        <w:t xml:space="preserve">Following the release and usability validation of the website as an optional study channel, IELTS Space will use voluntary learner feedback to refine the learning experience. Future versions may include: (i) native iOS and Android apps after the website has been tested with learners (LI-01); (ii) AI-powered Speaking assessment after speech recognition and scoring have been validated (LI-02); (iii) an English-learning community once there are enough active learners and a moderation plan is in place (LI-03); (iv) vocabulary flashcards after the video-based vocabulary experience has been evaluated (LI-04); and (v) a RAG-based IELTS assistant after a reliable knowledge base is available and answer quality has been tested (LI-05). These additions will be prioritized according to learner feedback, validation results, and available resources. </w:t>
+        <w:t xml:space="preserve">After the web and mobile apps are released and validated with learners, IELTS Space will use voluntary learner feedback to refine the learning experience. Future versions may include: (i) teacher dashboards and online class management so teachers can follow each student's progress between lessons (LI-07); (ii) AI-assisted question generation to help content authors expand the question bank; and (iii) a RAG-based IELTS assistant once a reliable knowledge base exists and answer quality has been tested (LI-05). These additions will be prioritised according to learner feedback, validation results and available resources.</w:t>
       </w:r>
     </w:p>
     <w:p xmlns:wp14="http://schemas.microsoft.com/office/word/2010/wordml" wp14:textId="63C3011B">

</xml_diff>